<commit_message>
Revise client TZ costs for 100 deals/day with realistic infra spend.
Clarify no long-term case storage on disk; size VPS/proxy/captcha
budgets to measured traffic (~1–2 GB proxy and ~17k RUB/year).

Co-authored-by: dier55555-cpu <dier55555-cpu@users.noreply.github.com>
</commit_message>
<xml_diff>
--- a/БитриксЮрист/ТЗ-БитриксЮрист.docx
+++ b/БитриксЮрист/ТЗ-БитриксЮрист.docx
@@ -159,12 +159,12 @@
     </w:p>
     <w:p>
       <w:pPr>
-        <w:spacing w:before="120" w:after="120"/>
         <w:ind w:left="283"/>
       </w:pPr>
       <w:r>
         <w:rPr>
           <w:rFonts w:ascii="Courier New" w:hAnsi="Courier New" w:eastAsia="Courier New"/>
+          <w:b w:val="0"/>
           <w:sz w:val="20"/>
         </w:rPr>
         <w:t>[БитриксЮрист] Обновление дела произведено</w:t>
@@ -598,12 +598,12 @@
     </w:p>
     <w:p>
       <w:pPr>
-        <w:spacing w:before="120" w:after="120"/>
         <w:ind w:left="283"/>
       </w:pPr>
       <w:r>
         <w:rPr>
           <w:rFonts w:ascii="Courier New" w:hAnsi="Courier New" w:eastAsia="Courier New"/>
+          <w:b w:val="0"/>
           <w:sz w:val="20"/>
         </w:rPr>
         <w:t>Битрикс24 (облако клиента)</w:t>
@@ -708,7 +708,7 @@
       </w:r>
       <w:r>
         <w:rPr>
-          <w:rFonts w:ascii="Courier New" w:hAnsi="Courier New" w:eastAsia="Times New Roman"/>
+          <w:rFonts w:ascii="Courier New" w:hAnsi="Courier New" w:eastAsia="Courier New"/>
           <w:b w:val="0"/>
           <w:sz w:val="22"/>
         </w:rPr>
@@ -737,7 +737,7 @@
       </w:r>
       <w:r>
         <w:rPr>
-          <w:rFonts w:ascii="Courier New" w:hAnsi="Courier New" w:eastAsia="Times New Roman"/>
+          <w:rFonts w:ascii="Courier New" w:hAnsi="Courier New" w:eastAsia="Courier New"/>
           <w:b w:val="0"/>
           <w:sz w:val="22"/>
         </w:rPr>
@@ -1363,7 +1363,7 @@
       </w:r>
       <w:r>
         <w:rPr>
-          <w:rFonts w:ascii="Courier New" w:hAnsi="Courier New" w:eastAsia="Times New Roman"/>
+          <w:rFonts w:ascii="Courier New" w:hAnsi="Courier New" w:eastAsia="Courier New"/>
           <w:b w:val="0"/>
           <w:sz w:val="22"/>
         </w:rPr>
@@ -1471,7 +1471,912 @@
           <w:b/>
           <w:sz w:val="24"/>
         </w:rPr>
-        <w:t>4.1. VPS (обязательно)</w:t>
+        <w:t>4.1. Что хранится на диске сервера</w:t>
+      </w:r>
+    </w:p>
+    <w:p>
+      <w:pPr>
+        <w:spacing w:after="120" w:line="276" w:lineRule="auto"/>
+      </w:pPr>
+      <w:r>
+        <w:rPr>
+          <w:rFonts w:ascii="Times New Roman" w:hAnsi="Times New Roman" w:eastAsia="Times New Roman"/>
+          <w:b/>
+          <w:sz w:val="24"/>
+        </w:rPr>
+        <w:t>Карточки дел и история статусов на диск сервера не складываются.</w:t>
+      </w:r>
+    </w:p>
+    <w:p>
+      <w:pPr>
+        <w:spacing w:after="120" w:line="276" w:lineRule="auto"/>
+      </w:pPr>
+      <w:r>
+        <w:rPr>
+          <w:rFonts w:ascii="Times New Roman" w:hAnsi="Times New Roman" w:eastAsia="Times New Roman"/>
+          <w:b w:val="0"/>
+          <w:sz w:val="24"/>
+        </w:rPr>
+        <w:t>Источник истины — Битрикс24 (поля сделки и лента комментариев).</w:t>
+      </w:r>
+    </w:p>
+    <w:p>
+      <w:pPr>
+        <w:spacing w:after="120" w:line="276" w:lineRule="auto"/>
+      </w:pPr>
+      <w:r>
+        <w:rPr>
+          <w:rFonts w:ascii="Times New Roman" w:hAnsi="Times New Roman" w:eastAsia="Times New Roman"/>
+          <w:b w:val="0"/>
+          <w:sz w:val="24"/>
+        </w:rPr>
+        <w:t>На VPS хранится только служебное:</w:t>
+      </w:r>
+    </w:p>
+    <w:tbl>
+      <w:tblPr>
+        <w:tblStyle w:val="TableGrid"/>
+        <w:tblW w:type="auto" w:w="0"/>
+        <w:tblLook w:firstColumn="1" w:firstRow="1" w:lastColumn="0" w:lastRow="0" w:noHBand="0" w:noVBand="1" w:val="04A0"/>
+      </w:tblPr>
+      <w:tblGrid>
+        <w:gridCol w:w="3230"/>
+        <w:gridCol w:w="3230"/>
+        <w:gridCol w:w="3230"/>
+      </w:tblGrid>
+      <w:tr>
+        <w:tc>
+          <w:tcPr>
+            <w:tcW w:type="dxa" w:w="3230"/>
+            <w:shd w:fill="D9E2F3" w:val="clear"/>
+          </w:tcPr>
+          <w:p>
+            <w:r/>
+            <w:r>
+              <w:rPr>
+                <w:rFonts w:ascii="Times New Roman" w:hAnsi="Times New Roman" w:eastAsia="Times New Roman"/>
+                <w:b/>
+                <w:sz w:val="22"/>
+              </w:rPr>
+              <w:t>Данные</w:t>
+            </w:r>
+          </w:p>
+        </w:tc>
+        <w:tc>
+          <w:tcPr>
+            <w:tcW w:type="dxa" w:w="3230"/>
+            <w:shd w:fill="D9E2F3" w:val="clear"/>
+          </w:tcPr>
+          <w:p>
+            <w:r/>
+            <w:r>
+              <w:rPr>
+                <w:rFonts w:ascii="Times New Roman" w:hAnsi="Times New Roman" w:eastAsia="Times New Roman"/>
+                <w:b/>
+                <w:sz w:val="22"/>
+              </w:rPr>
+              <w:t>Назначение</w:t>
+            </w:r>
+          </w:p>
+        </w:tc>
+        <w:tc>
+          <w:tcPr>
+            <w:tcW w:type="dxa" w:w="3230"/>
+            <w:shd w:fill="D9E2F3" w:val="clear"/>
+          </w:tcPr>
+          <w:p>
+            <w:r/>
+            <w:r>
+              <w:rPr>
+                <w:rFonts w:ascii="Times New Roman" w:hAnsi="Times New Roman" w:eastAsia="Times New Roman"/>
+                <w:b/>
+                <w:sz w:val="22"/>
+              </w:rPr>
+              <w:t>Объём</w:t>
+            </w:r>
+          </w:p>
+        </w:tc>
+      </w:tr>
+      <w:tr>
+        <w:tc>
+          <w:tcPr>
+            <w:tcW w:type="dxa" w:w="3230"/>
+          </w:tcPr>
+          <w:p>
+            <w:r/>
+            <w:r>
+              <w:rPr>
+                <w:rFonts w:ascii="Times New Roman" w:hAnsi="Times New Roman" w:eastAsia="Times New Roman"/>
+                <w:b w:val="0"/>
+                <w:sz w:val="20"/>
+              </w:rPr>
+              <w:t>Код системы + Python-окружение</w:t>
+            </w:r>
+          </w:p>
+        </w:tc>
+        <w:tc>
+          <w:tcPr>
+            <w:tcW w:type="dxa" w:w="3230"/>
+          </w:tcPr>
+          <w:p>
+            <w:r/>
+            <w:r>
+              <w:rPr>
+                <w:rFonts w:ascii="Times New Roman" w:hAnsi="Times New Roman" w:eastAsia="Times New Roman"/>
+                <w:b w:val="0"/>
+                <w:sz w:val="20"/>
+              </w:rPr>
+              <w:t>запуск парсера и агента</w:t>
+            </w:r>
+          </w:p>
+        </w:tc>
+        <w:tc>
+          <w:tcPr>
+            <w:tcW w:type="dxa" w:w="3230"/>
+          </w:tcPr>
+          <w:p>
+            <w:r/>
+            <w:r>
+              <w:rPr>
+                <w:rFonts w:ascii="Times New Roman" w:hAnsi="Times New Roman" w:eastAsia="Times New Roman"/>
+                <w:b w:val="0"/>
+                <w:sz w:val="20"/>
+              </w:rPr>
+              <w:t>~70–80 МБ</w:t>
+            </w:r>
+          </w:p>
+        </w:tc>
+      </w:tr>
+      <w:tr>
+        <w:tc>
+          <w:tcPr>
+            <w:tcW w:type="dxa" w:w="3230"/>
+          </w:tcPr>
+          <w:p>
+            <w:r/>
+            <w:r>
+              <w:rPr>
+                <w:rFonts w:ascii="Times New Roman" w:hAnsi="Times New Roman" w:eastAsia="Times New Roman"/>
+                <w:b w:val="0"/>
+                <w:sz w:val="20"/>
+              </w:rPr>
+              <w:t>Справочник судов (`courts-ru.json`)</w:t>
+            </w:r>
+          </w:p>
+        </w:tc>
+        <w:tc>
+          <w:tcPr>
+            <w:tcW w:type="dxa" w:w="3230"/>
+          </w:tcPr>
+          <w:p>
+            <w:r/>
+            <w:r>
+              <w:rPr>
+                <w:rFonts w:ascii="Times New Roman" w:hAnsi="Times New Roman" w:eastAsia="Times New Roman"/>
+                <w:b w:val="0"/>
+                <w:sz w:val="20"/>
+              </w:rPr>
+              <w:t>поиск сайта суда</w:t>
+            </w:r>
+          </w:p>
+        </w:tc>
+        <w:tc>
+          <w:tcPr>
+            <w:tcW w:type="dxa" w:w="3230"/>
+          </w:tcPr>
+          <w:p>
+            <w:r/>
+            <w:r>
+              <w:rPr>
+                <w:rFonts w:ascii="Times New Roman" w:hAnsi="Times New Roman" w:eastAsia="Times New Roman"/>
+                <w:b w:val="0"/>
+                <w:sz w:val="20"/>
+              </w:rPr>
+              <w:t>~6 МБ</w:t>
+            </w:r>
+          </w:p>
+        </w:tc>
+      </w:tr>
+      <w:tr>
+        <w:tc>
+          <w:tcPr>
+            <w:tcW w:type="dxa" w:w="3230"/>
+          </w:tcPr>
+          <w:p>
+            <w:r/>
+            <w:r>
+              <w:rPr>
+                <w:rFonts w:ascii="Times New Roman" w:hAnsi="Times New Roman" w:eastAsia="Times New Roman"/>
+                <w:b w:val="0"/>
+                <w:sz w:val="20"/>
+              </w:rPr>
+              <w:t>Конфигурация (`.env`)</w:t>
+            </w:r>
+          </w:p>
+        </w:tc>
+        <w:tc>
+          <w:tcPr>
+            <w:tcW w:type="dxa" w:w="3230"/>
+          </w:tcPr>
+          <w:p>
+            <w:r/>
+            <w:r>
+              <w:rPr>
+                <w:rFonts w:ascii="Times New Roman" w:hAnsi="Times New Roman" w:eastAsia="Times New Roman"/>
+                <w:b w:val="0"/>
+                <w:sz w:val="20"/>
+              </w:rPr>
+              <w:t>ключи и настройки</w:t>
+            </w:r>
+          </w:p>
+        </w:tc>
+        <w:tc>
+          <w:tcPr>
+            <w:tcW w:type="dxa" w:w="3230"/>
+          </w:tcPr>
+          <w:p>
+            <w:r/>
+            <w:r>
+              <w:rPr>
+                <w:rFonts w:ascii="Times New Roman" w:hAnsi="Times New Roman" w:eastAsia="Times New Roman"/>
+                <w:b w:val="0"/>
+                <w:sz w:val="20"/>
+              </w:rPr>
+              <w:t>килобайты</w:t>
+            </w:r>
+          </w:p>
+        </w:tc>
+      </w:tr>
+      <w:tr>
+        <w:tc>
+          <w:tcPr>
+            <w:tcW w:type="dxa" w:w="3230"/>
+          </w:tcPr>
+          <w:p>
+            <w:r/>
+            <w:r>
+              <w:rPr>
+                <w:rFonts w:ascii="Times New Roman" w:hAnsi="Times New Roman" w:eastAsia="Times New Roman"/>
+                <w:b w:val="0"/>
+                <w:sz w:val="20"/>
+              </w:rPr>
+              <w:t>Системные логи</w:t>
+            </w:r>
+          </w:p>
+        </w:tc>
+        <w:tc>
+          <w:tcPr>
+            <w:tcW w:type="dxa" w:w="3230"/>
+          </w:tcPr>
+          <w:p>
+            <w:r/>
+            <w:r>
+              <w:rPr>
+                <w:rFonts w:ascii="Times New Roman" w:hAnsi="Times New Roman" w:eastAsia="Times New Roman"/>
+                <w:b w:val="0"/>
+                <w:sz w:val="20"/>
+              </w:rPr>
+              <w:t>отладка</w:t>
+            </w:r>
+          </w:p>
+        </w:tc>
+        <w:tc>
+          <w:tcPr>
+            <w:tcW w:type="dxa" w:w="3230"/>
+          </w:tcPr>
+          <w:p>
+            <w:r/>
+            <w:r>
+              <w:rPr>
+                <w:rFonts w:ascii="Times New Roman" w:hAnsi="Times New Roman" w:eastAsia="Times New Roman"/>
+                <w:b w:val="0"/>
+                <w:sz w:val="20"/>
+              </w:rPr>
+              <w:t>обычно десятки–сотни МБ</w:t>
+            </w:r>
+          </w:p>
+        </w:tc>
+      </w:tr>
+      <w:tr>
+        <w:tc>
+          <w:tcPr>
+            <w:tcW w:type="dxa" w:w="3230"/>
+          </w:tcPr>
+          <w:p>
+            <w:r/>
+            <w:r>
+              <w:rPr>
+                <w:rFonts w:ascii="Times New Roman" w:hAnsi="Times New Roman" w:eastAsia="Times New Roman"/>
+                <w:b w:val="0"/>
+                <w:sz w:val="20"/>
+              </w:rPr>
+              <w:t>Опциональный кэш сырых ответов</w:t>
+            </w:r>
+          </w:p>
+        </w:tc>
+        <w:tc>
+          <w:tcPr>
+            <w:tcW w:type="dxa" w:w="3230"/>
+          </w:tcPr>
+          <w:p>
+            <w:r/>
+            <w:r>
+              <w:rPr>
+                <w:rFonts w:ascii="Times New Roman" w:hAnsi="Times New Roman" w:eastAsia="Times New Roman"/>
+                <w:b w:val="0"/>
+                <w:sz w:val="20"/>
+              </w:rPr>
+              <w:t>подстраховка на 7 дней, затем перезапись</w:t>
+            </w:r>
+          </w:p>
+        </w:tc>
+        <w:tc>
+          <w:tcPr>
+            <w:tcW w:type="dxa" w:w="3230"/>
+          </w:tcPr>
+          <w:p>
+            <w:r/>
+            <w:r>
+              <w:rPr>
+                <w:rFonts w:ascii="Times New Roman" w:hAnsi="Times New Roman" w:eastAsia="Times New Roman"/>
+                <w:b w:val="0"/>
+                <w:sz w:val="20"/>
+              </w:rPr>
+              <w:t>по желанию, не обязателен</w:t>
+            </w:r>
+          </w:p>
+        </w:tc>
+      </w:tr>
+    </w:tbl>
+    <w:p/>
+    <w:p>
+      <w:pPr>
+        <w:spacing w:after="120" w:line="276" w:lineRule="auto"/>
+      </w:pPr>
+      <w:r>
+        <w:rPr>
+          <w:rFonts w:ascii="Times New Roman" w:hAnsi="Times New Roman" w:eastAsia="Times New Roman"/>
+          <w:b w:val="0"/>
+          <w:sz w:val="24"/>
+        </w:rPr>
+        <w:t>Итого под сам продукт достаточно нескольких сотен мегабайт. Остальной диск — ОС Linux и запас под обновления.</w:t>
+      </w:r>
+    </w:p>
+    <w:p>
+      <w:pPr>
+        <w:spacing w:before="240" w:after="120"/>
+      </w:pPr>
+      <w:r>
+        <w:rPr>
+          <w:rFonts w:ascii="Times New Roman" w:hAnsi="Times New Roman" w:eastAsia="Times New Roman"/>
+          <w:b/>
+          <w:sz w:val="24"/>
+        </w:rPr>
+        <w:t>4.2. VPS (обязательно)</w:t>
+      </w:r>
+    </w:p>
+    <w:tbl>
+      <w:tblPr>
+        <w:tblStyle w:val="TableGrid"/>
+        <w:tblW w:type="auto" w:w="0"/>
+        <w:tblLook w:firstColumn="1" w:firstRow="1" w:lastColumn="0" w:lastRow="0" w:noHBand="0" w:noVBand="1" w:val="04A0"/>
+      </w:tblPr>
+      <w:tblGrid>
+        <w:gridCol w:w="3230"/>
+        <w:gridCol w:w="3230"/>
+        <w:gridCol w:w="3230"/>
+      </w:tblGrid>
+      <w:tr>
+        <w:tc>
+          <w:tcPr>
+            <w:tcW w:type="dxa" w:w="3230"/>
+            <w:shd w:fill="D9E2F3" w:val="clear"/>
+          </w:tcPr>
+          <w:p>
+            <w:r/>
+            <w:r>
+              <w:rPr>
+                <w:rFonts w:ascii="Times New Roman" w:hAnsi="Times New Roman" w:eastAsia="Times New Roman"/>
+                <w:b/>
+                <w:sz w:val="22"/>
+              </w:rPr>
+              <w:t>Параметр</w:t>
+            </w:r>
+          </w:p>
+        </w:tc>
+        <w:tc>
+          <w:tcPr>
+            <w:tcW w:type="dxa" w:w="3230"/>
+            <w:shd w:fill="D9E2F3" w:val="clear"/>
+          </w:tcPr>
+          <w:p>
+            <w:r/>
+            <w:r>
+              <w:rPr>
+                <w:rFonts w:ascii="Times New Roman" w:hAnsi="Times New Roman" w:eastAsia="Times New Roman"/>
+                <w:b/>
+                <w:sz w:val="22"/>
+              </w:rPr>
+              <w:t>Достаточно для старта</w:t>
+            </w:r>
+          </w:p>
+        </w:tc>
+        <w:tc>
+          <w:tcPr>
+            <w:tcW w:type="dxa" w:w="3230"/>
+            <w:shd w:fill="D9E2F3" w:val="clear"/>
+          </w:tcPr>
+          <w:p>
+            <w:r/>
+            <w:r>
+              <w:rPr>
+                <w:rFonts w:ascii="Times New Roman" w:hAnsi="Times New Roman" w:eastAsia="Times New Roman"/>
+                <w:b/>
+                <w:sz w:val="22"/>
+              </w:rPr>
+              <w:t>Когда увеличивать</w:t>
+            </w:r>
+          </w:p>
+        </w:tc>
+      </w:tr>
+      <w:tr>
+        <w:tc>
+          <w:tcPr>
+            <w:tcW w:type="dxa" w:w="3230"/>
+          </w:tcPr>
+          <w:p>
+            <w:r/>
+            <w:r>
+              <w:rPr>
+                <w:rFonts w:ascii="Times New Roman" w:hAnsi="Times New Roman" w:eastAsia="Times New Roman"/>
+                <w:b w:val="0"/>
+                <w:sz w:val="20"/>
+              </w:rPr>
+              <w:t>Расположение</w:t>
+            </w:r>
+          </w:p>
+        </w:tc>
+        <w:tc>
+          <w:tcPr>
+            <w:tcW w:type="dxa" w:w="3230"/>
+          </w:tcPr>
+          <w:p>
+            <w:r/>
+            <w:r>
+              <w:rPr>
+                <w:rFonts w:ascii="Times New Roman" w:hAnsi="Times New Roman" w:eastAsia="Times New Roman"/>
+                <w:b w:val="0"/>
+                <w:sz w:val="20"/>
+              </w:rPr>
+              <w:t>дата-центр **в РФ**</w:t>
+            </w:r>
+          </w:p>
+        </w:tc>
+        <w:tc>
+          <w:tcPr>
+            <w:tcW w:type="dxa" w:w="3230"/>
+          </w:tcPr>
+          <w:p>
+            <w:r/>
+            <w:r>
+              <w:rPr>
+                <w:rFonts w:ascii="Times New Roman" w:hAnsi="Times New Roman" w:eastAsia="Times New Roman"/>
+                <w:b w:val="0"/>
+                <w:sz w:val="20"/>
+              </w:rPr>
+              <w:t>—</w:t>
+            </w:r>
+          </w:p>
+        </w:tc>
+      </w:tr>
+      <w:tr>
+        <w:tc>
+          <w:tcPr>
+            <w:tcW w:type="dxa" w:w="3230"/>
+          </w:tcPr>
+          <w:p>
+            <w:r/>
+            <w:r>
+              <w:rPr>
+                <w:rFonts w:ascii="Times New Roman" w:hAnsi="Times New Roman" w:eastAsia="Times New Roman"/>
+                <w:b w:val="0"/>
+                <w:sz w:val="20"/>
+              </w:rPr>
+              <w:t>ОС</w:t>
+            </w:r>
+          </w:p>
+        </w:tc>
+        <w:tc>
+          <w:tcPr>
+            <w:tcW w:type="dxa" w:w="3230"/>
+          </w:tcPr>
+          <w:p>
+            <w:r/>
+            <w:r>
+              <w:rPr>
+                <w:rFonts w:ascii="Times New Roman" w:hAnsi="Times New Roman" w:eastAsia="Times New Roman"/>
+                <w:b w:val="0"/>
+                <w:sz w:val="20"/>
+              </w:rPr>
+              <w:t>Ubuntu 22.04 LTS</w:t>
+            </w:r>
+          </w:p>
+        </w:tc>
+        <w:tc>
+          <w:tcPr>
+            <w:tcW w:type="dxa" w:w="3230"/>
+          </w:tcPr>
+          <w:p>
+            <w:r/>
+            <w:r>
+              <w:rPr>
+                <w:rFonts w:ascii="Times New Roman" w:hAnsi="Times New Roman" w:eastAsia="Times New Roman"/>
+                <w:b w:val="0"/>
+                <w:sz w:val="20"/>
+              </w:rPr>
+              <w:t>—</w:t>
+            </w:r>
+          </w:p>
+        </w:tc>
+      </w:tr>
+      <w:tr>
+        <w:tc>
+          <w:tcPr>
+            <w:tcW w:type="dxa" w:w="3230"/>
+          </w:tcPr>
+          <w:p>
+            <w:r/>
+            <w:r>
+              <w:rPr>
+                <w:rFonts w:ascii="Times New Roman" w:hAnsi="Times New Roman" w:eastAsia="Times New Roman"/>
+                <w:b w:val="0"/>
+                <w:sz w:val="20"/>
+              </w:rPr>
+              <w:t>CPU</w:t>
+            </w:r>
+          </w:p>
+        </w:tc>
+        <w:tc>
+          <w:tcPr>
+            <w:tcW w:type="dxa" w:w="3230"/>
+          </w:tcPr>
+          <w:p>
+            <w:r/>
+            <w:r>
+              <w:rPr>
+                <w:rFonts w:ascii="Times New Roman" w:hAnsi="Times New Roman" w:eastAsia="Times New Roman"/>
+                <w:b w:val="0"/>
+                <w:sz w:val="20"/>
+              </w:rPr>
+              <w:t>**1 vCPU**</w:t>
+            </w:r>
+          </w:p>
+        </w:tc>
+        <w:tc>
+          <w:tcPr>
+            <w:tcW w:type="dxa" w:w="3230"/>
+          </w:tcPr>
+          <w:p>
+            <w:r/>
+            <w:r>
+              <w:rPr>
+                <w:rFonts w:ascii="Times New Roman" w:hAnsi="Times New Roman" w:eastAsia="Times New Roman"/>
+                <w:b w:val="0"/>
+                <w:sz w:val="20"/>
+              </w:rPr>
+              <w:t>при очень большой очереди сделок</w:t>
+            </w:r>
+          </w:p>
+        </w:tc>
+      </w:tr>
+      <w:tr>
+        <w:tc>
+          <w:tcPr>
+            <w:tcW w:type="dxa" w:w="3230"/>
+          </w:tcPr>
+          <w:p>
+            <w:r/>
+            <w:r>
+              <w:rPr>
+                <w:rFonts w:ascii="Times New Roman" w:hAnsi="Times New Roman" w:eastAsia="Times New Roman"/>
+                <w:b w:val="0"/>
+                <w:sz w:val="20"/>
+              </w:rPr>
+              <w:t>RAM</w:t>
+            </w:r>
+          </w:p>
+        </w:tc>
+        <w:tc>
+          <w:tcPr>
+            <w:tcW w:type="dxa" w:w="3230"/>
+          </w:tcPr>
+          <w:p>
+            <w:r/>
+            <w:r>
+              <w:rPr>
+                <w:rFonts w:ascii="Times New Roman" w:hAnsi="Times New Roman" w:eastAsia="Times New Roman"/>
+                <w:b w:val="0"/>
+                <w:sz w:val="20"/>
+              </w:rPr>
+              <w:t>**1 ГБ**</w:t>
+            </w:r>
+          </w:p>
+        </w:tc>
+        <w:tc>
+          <w:tcPr>
+            <w:tcW w:type="dxa" w:w="3230"/>
+          </w:tcPr>
+          <w:p>
+            <w:r/>
+            <w:r>
+              <w:rPr>
+                <w:rFonts w:ascii="Times New Roman" w:hAnsi="Times New Roman" w:eastAsia="Times New Roman"/>
+                <w:b w:val="0"/>
+                <w:sz w:val="20"/>
+              </w:rPr>
+              <w:t>если одновременно крутятся другие сервисы на том же VPS</w:t>
+            </w:r>
+          </w:p>
+        </w:tc>
+      </w:tr>
+      <w:tr>
+        <w:tc>
+          <w:tcPr>
+            <w:tcW w:type="dxa" w:w="3230"/>
+          </w:tcPr>
+          <w:p>
+            <w:r/>
+            <w:r>
+              <w:rPr>
+                <w:rFonts w:ascii="Times New Roman" w:hAnsi="Times New Roman" w:eastAsia="Times New Roman"/>
+                <w:b w:val="0"/>
+                <w:sz w:val="20"/>
+              </w:rPr>
+              <w:t>Диск</w:t>
+            </w:r>
+          </w:p>
+        </w:tc>
+        <w:tc>
+          <w:tcPr>
+            <w:tcW w:type="dxa" w:w="3230"/>
+          </w:tcPr>
+          <w:p>
+            <w:r/>
+            <w:r>
+              <w:rPr>
+                <w:rFonts w:ascii="Times New Roman" w:hAnsi="Times New Roman" w:eastAsia="Times New Roman"/>
+                <w:b w:val="0"/>
+                <w:sz w:val="20"/>
+              </w:rPr>
+              <w:t>**10–15 ГБ**</w:t>
+            </w:r>
+          </w:p>
+        </w:tc>
+        <w:tc>
+          <w:tcPr>
+            <w:tcW w:type="dxa" w:w="3230"/>
+          </w:tcPr>
+          <w:p>
+            <w:r/>
+            <w:r>
+              <w:rPr>
+                <w:rFonts w:ascii="Times New Roman" w:hAnsi="Times New Roman" w:eastAsia="Times New Roman"/>
+                <w:b w:val="0"/>
+                <w:sz w:val="20"/>
+              </w:rPr>
+              <w:t>при желании хранить недельный кэш логов</w:t>
+            </w:r>
+          </w:p>
+        </w:tc>
+      </w:tr>
+      <w:tr>
+        <w:tc>
+          <w:tcPr>
+            <w:tcW w:type="dxa" w:w="3230"/>
+          </w:tcPr>
+          <w:p>
+            <w:r/>
+            <w:r>
+              <w:rPr>
+                <w:rFonts w:ascii="Times New Roman" w:hAnsi="Times New Roman" w:eastAsia="Times New Roman"/>
+                <w:b w:val="0"/>
+                <w:sz w:val="20"/>
+              </w:rPr>
+              <w:t>Сеть</w:t>
+            </w:r>
+          </w:p>
+        </w:tc>
+        <w:tc>
+          <w:tcPr>
+            <w:tcW w:type="dxa" w:w="3230"/>
+          </w:tcPr>
+          <w:p>
+            <w:r/>
+            <w:r>
+              <w:rPr>
+                <w:rFonts w:ascii="Times New Roman" w:hAnsi="Times New Roman" w:eastAsia="Times New Roman"/>
+                <w:b w:val="0"/>
+                <w:sz w:val="20"/>
+              </w:rPr>
+              <w:t>выделенный IPv4</w:t>
+            </w:r>
+          </w:p>
+        </w:tc>
+        <w:tc>
+          <w:tcPr>
+            <w:tcW w:type="dxa" w:w="3230"/>
+          </w:tcPr>
+          <w:p>
+            <w:r/>
+            <w:r>
+              <w:rPr>
+                <w:rFonts w:ascii="Times New Roman" w:hAnsi="Times New Roman" w:eastAsia="Times New Roman"/>
+                <w:b w:val="0"/>
+                <w:sz w:val="20"/>
+              </w:rPr>
+              <w:t>—</w:t>
+            </w:r>
+          </w:p>
+        </w:tc>
+      </w:tr>
+      <w:tr>
+        <w:tc>
+          <w:tcPr>
+            <w:tcW w:type="dxa" w:w="3230"/>
+          </w:tcPr>
+          <w:p>
+            <w:r/>
+            <w:r>
+              <w:rPr>
+                <w:rFonts w:ascii="Times New Roman" w:hAnsi="Times New Roman" w:eastAsia="Times New Roman"/>
+                <w:b w:val="0"/>
+                <w:sz w:val="20"/>
+              </w:rPr>
+              <w:t>Доступ</w:t>
+            </w:r>
+          </w:p>
+        </w:tc>
+        <w:tc>
+          <w:tcPr>
+            <w:tcW w:type="dxa" w:w="3230"/>
+          </w:tcPr>
+          <w:p>
+            <w:r/>
+            <w:r>
+              <w:rPr>
+                <w:rFonts w:ascii="Times New Roman" w:hAnsi="Times New Roman" w:eastAsia="Times New Roman"/>
+                <w:b w:val="0"/>
+                <w:sz w:val="20"/>
+              </w:rPr>
+              <w:t>SSH по ключу, права root</w:t>
+            </w:r>
+          </w:p>
+        </w:tc>
+        <w:tc>
+          <w:tcPr>
+            <w:tcW w:type="dxa" w:w="3230"/>
+          </w:tcPr>
+          <w:p>
+            <w:r/>
+            <w:r>
+              <w:rPr>
+                <w:rFonts w:ascii="Times New Roman" w:hAnsi="Times New Roman" w:eastAsia="Times New Roman"/>
+                <w:b w:val="0"/>
+                <w:sz w:val="20"/>
+              </w:rPr>
+              <w:t>—</w:t>
+            </w:r>
+          </w:p>
+        </w:tc>
+      </w:tr>
+    </w:tbl>
+    <w:p/>
+    <w:p>
+      <w:pPr>
+        <w:spacing w:after="120" w:line="276" w:lineRule="auto"/>
+      </w:pPr>
+      <w:r>
+        <w:rPr>
+          <w:rFonts w:ascii="Times New Roman" w:hAnsi="Times New Roman" w:eastAsia="Times New Roman"/>
+          <w:b w:val="0"/>
+          <w:sz w:val="24"/>
+        </w:rPr>
+        <w:t xml:space="preserve">Публичный домен и SSL </w:t>
+      </w:r>
+      <w:r>
+        <w:rPr>
+          <w:rFonts w:ascii="Times New Roman" w:hAnsi="Times New Roman" w:eastAsia="Times New Roman"/>
+          <w:b/>
+          <w:sz w:val="24"/>
+        </w:rPr>
+        <w:t>не требуются</w:t>
+      </w:r>
+      <w:r>
+        <w:rPr>
+          <w:rFonts w:ascii="Times New Roman" w:hAnsi="Times New Roman" w:eastAsia="Times New Roman"/>
+          <w:b w:val="0"/>
+          <w:sz w:val="24"/>
+        </w:rPr>
+        <w:t xml:space="preserve">: сервисы слушают только </w:t>
+      </w:r>
+      <w:r>
+        <w:rPr>
+          <w:rFonts w:ascii="Courier New" w:hAnsi="Courier New" w:eastAsia="Courier New"/>
+          <w:b w:val="0"/>
+          <w:sz w:val="22"/>
+        </w:rPr>
+        <w:t>127.0.0.1</w:t>
+      </w:r>
+      <w:r>
+        <w:rPr>
+          <w:rFonts w:ascii="Times New Roman" w:hAnsi="Times New Roman" w:eastAsia="Times New Roman"/>
+          <w:b w:val="0"/>
+          <w:sz w:val="24"/>
+        </w:rPr>
+        <w:t>.</w:t>
+      </w:r>
+    </w:p>
+    <w:p>
+      <w:pPr>
+        <w:spacing w:before="240" w:after="120"/>
+      </w:pPr>
+      <w:r>
+        <w:rPr>
+          <w:rFonts w:ascii="Times New Roman" w:hAnsi="Times New Roman" w:eastAsia="Times New Roman"/>
+          <w:b/>
+          <w:sz w:val="24"/>
+        </w:rPr>
+        <w:t>4.3. Прокси с российскими IP (обязательно)</w:t>
+      </w:r>
+    </w:p>
+    <w:p>
+      <w:pPr>
+        <w:spacing w:after="120" w:line="276" w:lineRule="auto"/>
+      </w:pPr>
+      <w:r>
+        <w:rPr>
+          <w:rFonts w:ascii="Times New Roman" w:hAnsi="Times New Roman" w:eastAsia="Times New Roman"/>
+          <w:b w:val="0"/>
+          <w:sz w:val="24"/>
+        </w:rPr>
+        <w:t>Сайты судов ограничивают автоматизированные запросы — нужен HTTP(S)-прокси с IP в РФ.</w:t>
+      </w:r>
+    </w:p>
+    <w:p>
+      <w:pPr>
+        <w:spacing w:after="120" w:line="276" w:lineRule="auto"/>
+      </w:pPr>
+      <w:r>
+        <w:rPr>
+          <w:rFonts w:ascii="Times New Roman" w:hAnsi="Times New Roman" w:eastAsia="Times New Roman"/>
+          <w:b/>
+          <w:sz w:val="24"/>
+        </w:rPr>
+        <w:t>Реальный расход трафика</w:t>
+      </w:r>
+      <w:r>
+        <w:rPr>
+          <w:rFonts w:ascii="Times New Roman" w:hAnsi="Times New Roman" w:eastAsia="Times New Roman"/>
+          <w:b w:val="0"/>
+          <w:sz w:val="24"/>
+        </w:rPr>
+        <w:t xml:space="preserve"> при ежедневной проверке </w:t>
+      </w:r>
+      <w:r>
+        <w:rPr>
+          <w:rFonts w:ascii="Times New Roman" w:hAnsi="Times New Roman" w:eastAsia="Times New Roman"/>
+          <w:b/>
+          <w:sz w:val="24"/>
+        </w:rPr>
+        <w:t>100 дел</w:t>
+      </w:r>
+      <w:r>
+        <w:rPr>
+          <w:rFonts w:ascii="Times New Roman" w:hAnsi="Times New Roman" w:eastAsia="Times New Roman"/>
+          <w:b w:val="0"/>
+          <w:sz w:val="24"/>
+        </w:rPr>
+        <w:t xml:space="preserve"> (оценка по размеру страниц судов, с запасом на повторы):</w:t>
       </w:r>
     </w:p>
     <w:tbl>
@@ -1498,7 +2403,7 @@
                 <w:b/>
                 <w:sz w:val="22"/>
               </w:rPr>
-              <w:t>Параметр</w:t>
+              <w:t>Показатель</w:t>
             </w:r>
           </w:p>
         </w:tc>
@@ -1515,7 +2420,7 @@
                 <w:b/>
                 <w:sz w:val="22"/>
               </w:rPr>
-              <w:t>Минимум для продакшена</w:t>
+              <w:t>Оценка</w:t>
             </w:r>
           </w:p>
         </w:tc>
@@ -1533,7 +2438,7 @@
                 <w:b w:val="0"/>
                 <w:sz w:val="20"/>
               </w:rPr>
-              <w:t>Расположение</w:t>
+              <w:t>Трафик в сутки</w:t>
             </w:r>
           </w:p>
         </w:tc>
@@ -1549,7 +2454,7 @@
                 <w:b w:val="0"/>
                 <w:sz w:val="20"/>
               </w:rPr>
-              <w:t>дата-центр **в РФ**</w:t>
+              <w:t>~10–20 МБ</w:t>
             </w:r>
           </w:p>
         </w:tc>
@@ -1567,7 +2472,7 @@
                 <w:b w:val="0"/>
                 <w:sz w:val="20"/>
               </w:rPr>
-              <w:t>ОС</w:t>
+              <w:t>Трафик в месяц</w:t>
             </w:r>
           </w:p>
         </w:tc>
@@ -1583,7 +2488,7 @@
                 <w:b w:val="0"/>
                 <w:sz w:val="20"/>
               </w:rPr>
-              <w:t>Ubuntu 22.04 LTS (или совместимая)</w:t>
+              <w:t>**~0,4–0,8 ГБ**</w:t>
             </w:r>
           </w:p>
         </w:tc>
@@ -1601,7 +2506,7 @@
                 <w:b w:val="0"/>
                 <w:sz w:val="20"/>
               </w:rPr>
-              <w:t>CPU</w:t>
+              <w:t>С запасом на сбои/повторы</w:t>
             </w:r>
           </w:p>
         </w:tc>
@@ -1617,7 +2522,165 @@
                 <w:b w:val="0"/>
                 <w:sz w:val="20"/>
               </w:rPr>
-              <w:t>2 vCPU</w:t>
+              <w:t>**до ~1–2 ГБ/мес**</w:t>
+            </w:r>
+          </w:p>
+        </w:tc>
+      </w:tr>
+    </w:tbl>
+    <w:p/>
+    <w:p>
+      <w:pPr>
+        <w:spacing w:after="120" w:line="276" w:lineRule="auto"/>
+      </w:pPr>
+      <w:r>
+        <w:rPr>
+          <w:rFonts w:ascii="Times New Roman" w:hAnsi="Times New Roman" w:eastAsia="Times New Roman"/>
+          <w:b w:val="0"/>
+          <w:sz w:val="24"/>
+        </w:rPr>
+        <w:t xml:space="preserve">На старте достаточно пакета </w:t>
+      </w:r>
+      <w:r>
+        <w:rPr>
+          <w:rFonts w:ascii="Times New Roman" w:hAnsi="Times New Roman" w:eastAsia="Times New Roman"/>
+          <w:b/>
+          <w:sz w:val="24"/>
+        </w:rPr>
+        <w:t>1–2 ГБ/мес</w:t>
+      </w:r>
+      <w:r>
+        <w:rPr>
+          <w:rFonts w:ascii="Times New Roman" w:hAnsi="Times New Roman" w:eastAsia="Times New Roman"/>
+          <w:b w:val="0"/>
+          <w:sz w:val="24"/>
+        </w:rPr>
+        <w:t xml:space="preserve"> или pay-as-you-go на тот же объём.</w:t>
+      </w:r>
+    </w:p>
+    <w:p>
+      <w:pPr>
+        <w:spacing w:after="120" w:line="276" w:lineRule="auto"/>
+      </w:pPr>
+      <w:r>
+        <w:rPr>
+          <w:rFonts w:ascii="Times New Roman" w:hAnsi="Times New Roman" w:eastAsia="Times New Roman"/>
+          <w:b w:val="0"/>
+          <w:sz w:val="24"/>
+        </w:rPr>
+        <w:t>Пакет «10 ГБ» не обязателен — это избыточный запас, не расчёт под 100 дел.</w:t>
+      </w:r>
+    </w:p>
+    <w:p>
+      <w:pPr>
+        <w:spacing w:after="120" w:line="276" w:lineRule="auto"/>
+      </w:pPr>
+      <w:r>
+        <w:rPr>
+          <w:rFonts w:ascii="Times New Roman" w:hAnsi="Times New Roman" w:eastAsia="Times New Roman"/>
+          <w:b w:val="0"/>
+          <w:sz w:val="24"/>
+        </w:rPr>
+        <w:t>Рекомендация: геолокация Россия, несколько sticky-портов (3–10).</w:t>
+      </w:r>
+    </w:p>
+    <w:p>
+      <w:pPr>
+        <w:spacing w:before="240" w:after="120"/>
+      </w:pPr>
+      <w:r>
+        <w:rPr>
+          <w:rFonts w:ascii="Times New Roman" w:hAnsi="Times New Roman" w:eastAsia="Times New Roman"/>
+          <w:b/>
+          <w:sz w:val="24"/>
+        </w:rPr>
+        <w:t>4.4. Сервис распознавания капчи (для мировых судей)</w:t>
+      </w:r>
+    </w:p>
+    <w:p>
+      <w:pPr>
+        <w:spacing w:after="120" w:line="276" w:lineRule="auto"/>
+      </w:pPr>
+      <w:r>
+        <w:rPr>
+          <w:rFonts w:ascii="Times New Roman" w:hAnsi="Times New Roman" w:eastAsia="Times New Roman"/>
+          <w:b w:val="0"/>
+          <w:sz w:val="24"/>
+        </w:rPr>
+        <w:t>На сайтах мировых судей часто показывается графическая капча (RuCaptcha / 2captcha или аналог).</w:t>
+      </w:r>
+    </w:p>
+    <w:p>
+      <w:pPr>
+        <w:spacing w:after="120" w:line="276" w:lineRule="auto"/>
+      </w:pPr>
+      <w:r>
+        <w:rPr>
+          <w:rFonts w:ascii="Times New Roman" w:hAnsi="Times New Roman" w:eastAsia="Times New Roman"/>
+          <w:b w:val="0"/>
+          <w:sz w:val="24"/>
+        </w:rPr>
+        <w:t xml:space="preserve">При </w:t>
+      </w:r>
+      <w:r>
+        <w:rPr>
+          <w:rFonts w:ascii="Times New Roman" w:hAnsi="Times New Roman" w:eastAsia="Times New Roman"/>
+          <w:b/>
+          <w:sz w:val="24"/>
+        </w:rPr>
+        <w:t>100 делах/сутки</w:t>
+      </w:r>
+      <w:r>
+        <w:rPr>
+          <w:rFonts w:ascii="Times New Roman" w:hAnsi="Times New Roman" w:eastAsia="Times New Roman"/>
+          <w:b w:val="0"/>
+          <w:sz w:val="24"/>
+        </w:rPr>
+        <w:t>, если ~40% — мировые (ориентир):</w:t>
+      </w:r>
+    </w:p>
+    <w:tbl>
+      <w:tblPr>
+        <w:tblStyle w:val="TableGrid"/>
+        <w:tblW w:type="auto" w:w="0"/>
+        <w:tblLook w:firstColumn="1" w:firstRow="1" w:lastColumn="0" w:lastRow="0" w:noHBand="0" w:noVBand="1" w:val="04A0"/>
+      </w:tblPr>
+      <w:tblGrid>
+        <w:gridCol w:w="4844"/>
+        <w:gridCol w:w="4844"/>
+      </w:tblGrid>
+      <w:tr>
+        <w:tc>
+          <w:tcPr>
+            <w:tcW w:type="dxa" w:w="4844"/>
+            <w:shd w:fill="D9E2F3" w:val="clear"/>
+          </w:tcPr>
+          <w:p>
+            <w:r/>
+            <w:r>
+              <w:rPr>
+                <w:rFonts w:ascii="Times New Roman" w:hAnsi="Times New Roman" w:eastAsia="Times New Roman"/>
+                <w:b/>
+                <w:sz w:val="22"/>
+              </w:rPr>
+              <w:t>Показатель</w:t>
+            </w:r>
+          </w:p>
+        </w:tc>
+        <w:tc>
+          <w:tcPr>
+            <w:tcW w:type="dxa" w:w="4844"/>
+            <w:shd w:fill="D9E2F3" w:val="clear"/>
+          </w:tcPr>
+          <w:p>
+            <w:r/>
+            <w:r>
+              <w:rPr>
+                <w:rFonts w:ascii="Times New Roman" w:hAnsi="Times New Roman" w:eastAsia="Times New Roman"/>
+                <w:b/>
+                <w:sz w:val="22"/>
+              </w:rPr>
+              <w:t>Оценка</w:t>
             </w:r>
           </w:p>
         </w:tc>
@@ -1635,7 +2698,7 @@
                 <w:b w:val="0"/>
                 <w:sz w:val="20"/>
               </w:rPr>
-              <w:t>RAM</w:t>
+              <w:t>Решений капчи в месяц</w:t>
             </w:r>
           </w:p>
         </w:tc>
@@ -1651,7 +2714,7 @@
                 <w:b w:val="0"/>
                 <w:sz w:val="20"/>
               </w:rPr>
-              <w:t>2 ГБ (рекомендуется)</w:t>
+              <w:t>~1 500–2 500 (с учётом повторов)</w:t>
             </w:r>
           </w:p>
         </w:tc>
@@ -1669,7 +2732,7 @@
                 <w:b w:val="0"/>
                 <w:sz w:val="20"/>
               </w:rPr>
-              <w:t>Диск</w:t>
+              <w:t>Стоимость API</w:t>
             </w:r>
           </w:p>
         </w:tc>
@@ -1685,75 +2748,7 @@
                 <w:b w:val="0"/>
                 <w:sz w:val="20"/>
               </w:rPr>
-              <w:t>от 20 ГБ SSD/NVMe</w:t>
-            </w:r>
-          </w:p>
-        </w:tc>
-      </w:tr>
-      <w:tr>
-        <w:tc>
-          <w:tcPr>
-            <w:tcW w:type="dxa" w:w="4844"/>
-          </w:tcPr>
-          <w:p>
-            <w:r/>
-            <w:r>
-              <w:rPr>
-                <w:rFonts w:ascii="Times New Roman" w:hAnsi="Times New Roman" w:eastAsia="Times New Roman"/>
-                <w:b w:val="0"/>
-                <w:sz w:val="20"/>
-              </w:rPr>
-              <w:t>Сеть</w:t>
-            </w:r>
-          </w:p>
-        </w:tc>
-        <w:tc>
-          <w:tcPr>
-            <w:tcW w:type="dxa" w:w="4844"/>
-          </w:tcPr>
-          <w:p>
-            <w:r/>
-            <w:r>
-              <w:rPr>
-                <w:rFonts w:ascii="Times New Roman" w:hAnsi="Times New Roman" w:eastAsia="Times New Roman"/>
-                <w:b w:val="0"/>
-                <w:sz w:val="20"/>
-              </w:rPr>
-              <w:t>выделенный IPv4</w:t>
-            </w:r>
-          </w:p>
-        </w:tc>
-      </w:tr>
-      <w:tr>
-        <w:tc>
-          <w:tcPr>
-            <w:tcW w:type="dxa" w:w="4844"/>
-          </w:tcPr>
-          <w:p>
-            <w:r/>
-            <w:r>
-              <w:rPr>
-                <w:rFonts w:ascii="Times New Roman" w:hAnsi="Times New Roman" w:eastAsia="Times New Roman"/>
-                <w:b w:val="0"/>
-                <w:sz w:val="20"/>
-              </w:rPr>
-              <w:t>Доступ</w:t>
-            </w:r>
-          </w:p>
-        </w:tc>
-        <w:tc>
-          <w:tcPr>
-            <w:tcW w:type="dxa" w:w="4844"/>
-          </w:tcPr>
-          <w:p>
-            <w:r/>
-            <w:r>
-              <w:rPr>
-                <w:rFonts w:ascii="Times New Roman" w:hAnsi="Times New Roman" w:eastAsia="Times New Roman"/>
-                <w:b w:val="0"/>
-                <w:sz w:val="20"/>
-              </w:rPr>
-              <w:t>SSH по ключу, права root</w:t>
+              <w:t>порядка **150–400 ₽/мес**</w:t>
             </w:r>
           </w:p>
         </w:tc>
@@ -1770,182 +2765,46 @@
           <w:b w:val="0"/>
           <w:sz w:val="24"/>
         </w:rPr>
-        <w:t xml:space="preserve">Публичный домен и SSL для системы </w:t>
+        <w:t>Если мировых дел мало — расход ниже.</w:t>
       </w:r>
+    </w:p>
+    <w:p>
+      <w:pPr>
+        <w:spacing w:before="240" w:after="120"/>
+      </w:pPr>
       <w:r>
         <w:rPr>
           <w:rFonts w:ascii="Times New Roman" w:hAnsi="Times New Roman" w:eastAsia="Times New Roman"/>
           <w:b/>
           <w:sz w:val="24"/>
         </w:rPr>
-        <w:t>не требуются</w:t>
+        <w:t>4.5. Справочник судов</w:t>
       </w:r>
+    </w:p>
+    <w:p>
+      <w:pPr>
+        <w:spacing w:after="120" w:line="276" w:lineRule="auto"/>
+      </w:pPr>
       <w:r>
         <w:rPr>
           <w:rFonts w:ascii="Times New Roman" w:hAnsi="Times New Roman" w:eastAsia="Times New Roman"/>
           <w:b w:val="0"/>
           <w:sz w:val="24"/>
         </w:rPr>
-        <w:t xml:space="preserve">: сервисы слушают только </w:t>
+        <w:t>Поставляется в составе решения (JSON на сервере, ~10 000 записей, ~6 МБ).</w:t>
       </w:r>
-      <w:r>
-        <w:rPr>
-          <w:rFonts w:ascii="Courier New" w:hAnsi="Courier New" w:eastAsia="Times New Roman"/>
-          <w:b w:val="0"/>
-          <w:sz w:val="22"/>
-        </w:rPr>
-        <w:t>127.0.0.1</w:t>
-      </w:r>
+    </w:p>
+    <w:p>
+      <w:pPr>
+        <w:spacing w:after="120" w:line="276" w:lineRule="auto"/>
+      </w:pPr>
       <w:r>
         <w:rPr>
           <w:rFonts w:ascii="Times New Roman" w:hAnsi="Times New Roman" w:eastAsia="Times New Roman"/>
           <w:b w:val="0"/>
           <w:sz w:val="24"/>
         </w:rPr>
-        <w:t>.</w:t>
-      </w:r>
-    </w:p>
-    <w:p>
-      <w:pPr>
-        <w:spacing w:before="240" w:after="120"/>
-      </w:pPr>
-      <w:r>
-        <w:rPr>
-          <w:rFonts w:ascii="Times New Roman" w:hAnsi="Times New Roman" w:eastAsia="Times New Roman"/>
-          <w:b/>
-          <w:sz w:val="24"/>
-        </w:rPr>
-        <w:t>4.2. Прокси с российскими IP (обязательно)</w:t>
-      </w:r>
-    </w:p>
-    <w:p>
-      <w:pPr>
-        <w:spacing w:after="120" w:line="276" w:lineRule="auto"/>
-      </w:pPr>
-      <w:r>
-        <w:rPr>
-          <w:rFonts w:ascii="Times New Roman" w:hAnsi="Times New Roman" w:eastAsia="Times New Roman"/>
-          <w:b w:val="0"/>
-          <w:sz w:val="24"/>
-        </w:rPr>
-        <w:t>Сайты судов ограничивают автоматизированные запросы. Для стабильной работы нужен пул HTTP(S)-прокси с IP в РФ (резидентские или ISP).</w:t>
-      </w:r>
-    </w:p>
-    <w:p>
-      <w:pPr>
-        <w:spacing w:after="120" w:line="276" w:lineRule="auto"/>
-      </w:pPr>
-      <w:r>
-        <w:rPr>
-          <w:rFonts w:ascii="Times New Roman" w:hAnsi="Times New Roman" w:eastAsia="Times New Roman"/>
-          <w:b w:val="0"/>
-          <w:sz w:val="24"/>
-        </w:rPr>
-        <w:t>Рекомендуемые параметры на старте:</w:t>
-      </w:r>
-    </w:p>
-    <w:p>
-      <w:pPr>
-        <w:spacing w:after="120" w:line="276" w:lineRule="auto"/>
-      </w:pPr>
-      <w:r>
-        <w:rPr>
-          <w:rFonts w:ascii="Times New Roman" w:hAnsi="Times New Roman" w:eastAsia="Times New Roman"/>
-          <w:b w:val="0"/>
-          <w:sz w:val="24"/>
-        </w:rPr>
-        <w:t>• геолокация: Россия;</w:t>
-      </w:r>
-    </w:p>
-    <w:p>
-      <w:pPr>
-        <w:spacing w:after="120" w:line="276" w:lineRule="auto"/>
-      </w:pPr>
-      <w:r>
-        <w:rPr>
-          <w:rFonts w:ascii="Times New Roman" w:hAnsi="Times New Roman" w:eastAsia="Times New Roman"/>
-          <w:b w:val="0"/>
-          <w:sz w:val="24"/>
-        </w:rPr>
-        <w:t>• 5–20 sticky-портов;</w:t>
-      </w:r>
-    </w:p>
-    <w:p>
-      <w:pPr>
-        <w:spacing w:after="120" w:line="276" w:lineRule="auto"/>
-      </w:pPr>
-      <w:r>
-        <w:rPr>
-          <w:rFonts w:ascii="Times New Roman" w:hAnsi="Times New Roman" w:eastAsia="Times New Roman"/>
-          <w:b w:val="0"/>
-          <w:sz w:val="24"/>
-        </w:rPr>
-        <w:t>• пакет трафика от 10 ГБ.</w:t>
-      </w:r>
-    </w:p>
-    <w:p>
-      <w:pPr>
-        <w:spacing w:before="240" w:after="120"/>
-      </w:pPr>
-      <w:r>
-        <w:rPr>
-          <w:rFonts w:ascii="Times New Roman" w:hAnsi="Times New Roman" w:eastAsia="Times New Roman"/>
-          <w:b/>
-          <w:sz w:val="24"/>
-        </w:rPr>
-        <w:t>4.3. Сервис распознавания капчи (обязательно для мировых судей)</w:t>
-      </w:r>
-    </w:p>
-    <w:p>
-      <w:pPr>
-        <w:spacing w:after="120" w:line="276" w:lineRule="auto"/>
-      </w:pPr>
-      <w:r>
-        <w:rPr>
-          <w:rFonts w:ascii="Times New Roman" w:hAnsi="Times New Roman" w:eastAsia="Times New Roman"/>
-          <w:b w:val="0"/>
-          <w:sz w:val="24"/>
-        </w:rPr>
-        <w:t>На сайтах мировых судей почти всегда показывается графическая капча. Используется API-сервис распознавания (RuCaptcha / 2captcha или аналог).</w:t>
-      </w:r>
-    </w:p>
-    <w:p>
-      <w:pPr>
-        <w:spacing w:before="240" w:after="120"/>
-      </w:pPr>
-      <w:r>
-        <w:rPr>
-          <w:rFonts w:ascii="Times New Roman" w:hAnsi="Times New Roman" w:eastAsia="Times New Roman"/>
-          <w:b/>
-          <w:sz w:val="24"/>
-        </w:rPr>
-        <w:t>4.4. Справочник судов</w:t>
-      </w:r>
-    </w:p>
-    <w:p>
-      <w:pPr>
-        <w:spacing w:after="120" w:line="276" w:lineRule="auto"/>
-      </w:pPr>
-      <w:r>
-        <w:rPr>
-          <w:rFonts w:ascii="Times New Roman" w:hAnsi="Times New Roman" w:eastAsia="Times New Roman"/>
-          <w:b w:val="0"/>
-          <w:sz w:val="24"/>
-        </w:rPr>
-        <w:t>Поставляется в составе решения (JSON на сервере, ~10 000 записей).</w:t>
-      </w:r>
-    </w:p>
-    <w:p>
-      <w:pPr>
-        <w:spacing w:after="120" w:line="276" w:lineRule="auto"/>
-      </w:pPr>
-      <w:r>
-        <w:rPr>
-          <w:rFonts w:ascii="Times New Roman" w:hAnsi="Times New Roman" w:eastAsia="Times New Roman"/>
-          <w:b w:val="0"/>
-          <w:sz w:val="24"/>
-        </w:rPr>
-        <w:t>Обновление справочника выполняется по регламенту сопровождения (выгрузка из актуальных таблиц судов РФ).</w:t>
+        <w:t>Обновление — по регламенту сопровождения.</w:t>
       </w:r>
     </w:p>
     <w:p>
@@ -2040,7 +2899,7 @@
       </w:r>
       <w:r>
         <w:rPr>
-          <w:rFonts w:ascii="Courier New" w:hAnsi="Courier New" w:eastAsia="Times New Roman"/>
+          <w:rFonts w:ascii="Courier New" w:hAnsi="Courier New" w:eastAsia="Courier New"/>
           <w:b w:val="0"/>
           <w:sz w:val="22"/>
         </w:rPr>
@@ -2663,7 +3522,7 @@
           <w:b/>
           <w:sz w:val="28"/>
         </w:rPr>
-        <w:t>7. Ориентировочные расходы на 12 месяцев</w:t>
+        <w:t>7. Расходы инфраструктуры: сценарий «100 дел каждый день»</w:t>
       </w:r>
     </w:p>
     <w:p>
@@ -2676,20 +3535,241 @@
           <w:b w:val="0"/>
           <w:sz w:val="24"/>
         </w:rPr>
-        <w:t>Цены ориентировочные, зависят от тарифов провайдеров на момент оплаты. Перед закупкой сверяйте актуальные прайсы.</w:t>
+        <w:t xml:space="preserve">Базовый расчёт: </w:t>
       </w:r>
-    </w:p>
-    <w:p>
-      <w:pPr>
-        <w:spacing w:before="240" w:after="120"/>
-      </w:pPr>
       <w:r>
         <w:rPr>
           <w:rFonts w:ascii="Times New Roman" w:hAnsi="Times New Roman" w:eastAsia="Times New Roman"/>
           <w:b/>
           <w:sz w:val="24"/>
         </w:rPr>
-        <w:t>7.1. Ежемесячные операционные расходы</w:t>
+        <w:t>ежедневно проверяются и при необходимости обновляются 100 сделок</w:t>
+      </w:r>
+      <w:r>
+        <w:rPr>
+          <w:rFonts w:ascii="Times New Roman" w:hAnsi="Times New Roman" w:eastAsia="Times New Roman"/>
+          <w:b w:val="0"/>
+          <w:sz w:val="24"/>
+        </w:rPr>
+        <w:t>.</w:t>
+      </w:r>
+    </w:p>
+    <w:p>
+      <w:pPr>
+        <w:spacing w:after="120" w:line="276" w:lineRule="auto"/>
+      </w:pPr>
+      <w:r>
+        <w:rPr>
+          <w:rFonts w:ascii="Times New Roman" w:hAnsi="Times New Roman" w:eastAsia="Times New Roman"/>
+          <w:b w:val="0"/>
+          <w:sz w:val="24"/>
+        </w:rPr>
+        <w:t>Цены ориентировочные; перед оплатой сверяйте прайсы провайдеров.</w:t>
+      </w:r>
+    </w:p>
+    <w:p>
+      <w:pPr>
+        <w:spacing w:after="120" w:line="276" w:lineRule="auto"/>
+      </w:pPr>
+      <w:r>
+        <w:rPr>
+          <w:rFonts w:ascii="Times New Roman" w:hAnsi="Times New Roman" w:eastAsia="Times New Roman"/>
+          <w:b w:val="0"/>
+          <w:sz w:val="24"/>
+        </w:rPr>
+        <w:t xml:space="preserve">В расчёт </w:t>
+      </w:r>
+      <w:r>
+        <w:rPr>
+          <w:rFonts w:ascii="Times New Roman" w:hAnsi="Times New Roman" w:eastAsia="Times New Roman"/>
+          <w:b/>
+          <w:sz w:val="24"/>
+        </w:rPr>
+        <w:t>не</w:t>
+      </w:r>
+      <w:r>
+        <w:rPr>
+          <w:rFonts w:ascii="Times New Roman" w:hAnsi="Times New Roman" w:eastAsia="Times New Roman"/>
+          <w:b w:val="0"/>
+          <w:sz w:val="24"/>
+        </w:rPr>
+        <w:t xml:space="preserve"> входят работы внедрения и абонентка — только VPS + прокси + капча.</w:t>
+      </w:r>
+    </w:p>
+    <w:p>
+      <w:pPr>
+        <w:spacing w:before="240" w:after="120"/>
+      </w:pPr>
+      <w:r>
+        <w:rPr>
+          <w:rFonts w:ascii="Times New Roman" w:hAnsi="Times New Roman" w:eastAsia="Times New Roman"/>
+          <w:b/>
+          <w:sz w:val="24"/>
+        </w:rPr>
+        <w:t>7.1. Откуда цифры</w:t>
+      </w:r>
+    </w:p>
+    <w:tbl>
+      <w:tblPr>
+        <w:tblStyle w:val="TableGrid"/>
+        <w:tblW w:type="auto" w:w="0"/>
+        <w:tblLook w:firstColumn="1" w:firstRow="1" w:lastColumn="0" w:lastRow="0" w:noHBand="0" w:noVBand="1" w:val="04A0"/>
+      </w:tblPr>
+      <w:tblGrid>
+        <w:gridCol w:w="4844"/>
+        <w:gridCol w:w="4844"/>
+      </w:tblGrid>
+      <w:tr>
+        <w:tc>
+          <w:tcPr>
+            <w:tcW w:type="dxa" w:w="4844"/>
+            <w:shd w:fill="D9E2F3" w:val="clear"/>
+          </w:tcPr>
+          <w:p>
+            <w:r/>
+            <w:r>
+              <w:rPr>
+                <w:rFonts w:ascii="Times New Roman" w:hAnsi="Times New Roman" w:eastAsia="Times New Roman"/>
+                <w:b/>
+                <w:sz w:val="22"/>
+              </w:rPr>
+              <w:t>Статья</w:t>
+            </w:r>
+          </w:p>
+        </w:tc>
+        <w:tc>
+          <w:tcPr>
+            <w:tcW w:type="dxa" w:w="4844"/>
+            <w:shd w:fill="D9E2F3" w:val="clear"/>
+          </w:tcPr>
+          <w:p>
+            <w:r/>
+            <w:r>
+              <w:rPr>
+                <w:rFonts w:ascii="Times New Roman" w:hAnsi="Times New Roman" w:eastAsia="Times New Roman"/>
+                <w:b/>
+                <w:sz w:val="22"/>
+              </w:rPr>
+              <w:t>Логика расчёта</w:t>
+            </w:r>
+          </w:p>
+        </w:tc>
+      </w:tr>
+      <w:tr>
+        <w:tc>
+          <w:tcPr>
+            <w:tcW w:type="dxa" w:w="4844"/>
+          </w:tcPr>
+          <w:p>
+            <w:r/>
+            <w:r>
+              <w:rPr>
+                <w:rFonts w:ascii="Times New Roman" w:hAnsi="Times New Roman" w:eastAsia="Times New Roman"/>
+                <w:b w:val="0"/>
+                <w:sz w:val="20"/>
+              </w:rPr>
+              <w:t>VPS</w:t>
+            </w:r>
+          </w:p>
+        </w:tc>
+        <w:tc>
+          <w:tcPr>
+            <w:tcW w:type="dxa" w:w="4844"/>
+          </w:tcPr>
+          <w:p>
+            <w:r/>
+            <w:r>
+              <w:rPr>
+                <w:rFonts w:ascii="Times New Roman" w:hAnsi="Times New Roman" w:eastAsia="Times New Roman"/>
+                <w:b w:val="0"/>
+                <w:sz w:val="20"/>
+              </w:rPr>
+              <w:t>Достаточно тарифа **1 vCPU / 1 ГБ / 10–15 ГБ** в РФ — под код, справочник и ОС</w:t>
+            </w:r>
+          </w:p>
+        </w:tc>
+      </w:tr>
+      <w:tr>
+        <w:tc>
+          <w:tcPr>
+            <w:tcW w:type="dxa" w:w="4844"/>
+          </w:tcPr>
+          <w:p>
+            <w:r/>
+            <w:r>
+              <w:rPr>
+                <w:rFonts w:ascii="Times New Roman" w:hAnsi="Times New Roman" w:eastAsia="Times New Roman"/>
+                <w:b w:val="0"/>
+                <w:sz w:val="20"/>
+              </w:rPr>
+              <w:t>Прокси</w:t>
+            </w:r>
+          </w:p>
+        </w:tc>
+        <w:tc>
+          <w:tcPr>
+            <w:tcW w:type="dxa" w:w="4844"/>
+          </w:tcPr>
+          <w:p>
+            <w:r/>
+            <w:r>
+              <w:rPr>
+                <w:rFonts w:ascii="Times New Roman" w:hAnsi="Times New Roman" w:eastAsia="Times New Roman"/>
+                <w:b w:val="0"/>
+                <w:sz w:val="20"/>
+              </w:rPr>
+              <w:t>~0,5–1 ГБ трафика в месяц на 100 дел/сутки → пакет **1–2 ГБ**, не 10 ГБ</w:t>
+            </w:r>
+          </w:p>
+        </w:tc>
+      </w:tr>
+      <w:tr>
+        <w:tc>
+          <w:tcPr>
+            <w:tcW w:type="dxa" w:w="4844"/>
+          </w:tcPr>
+          <w:p>
+            <w:r/>
+            <w:r>
+              <w:rPr>
+                <w:rFonts w:ascii="Times New Roman" w:hAnsi="Times New Roman" w:eastAsia="Times New Roman"/>
+                <w:b w:val="0"/>
+                <w:sz w:val="20"/>
+              </w:rPr>
+              <w:t>Капча</w:t>
+            </w:r>
+          </w:p>
+        </w:tc>
+        <w:tc>
+          <w:tcPr>
+            <w:tcW w:type="dxa" w:w="4844"/>
+          </w:tcPr>
+          <w:p>
+            <w:r/>
+            <w:r>
+              <w:rPr>
+                <w:rFonts w:ascii="Times New Roman" w:hAnsi="Times New Roman" w:eastAsia="Times New Roman"/>
+                <w:b w:val="0"/>
+                <w:sz w:val="20"/>
+              </w:rPr>
+              <w:t>только мировые участки; при доле ~40% — порядка 1,5–2,5 тыс. решений/мес</w:t>
+            </w:r>
+          </w:p>
+        </w:tc>
+      </w:tr>
+    </w:tbl>
+    <w:p/>
+    <w:p>
+      <w:pPr>
+        <w:spacing w:before="240" w:after="120"/>
+      </w:pPr>
+      <w:r>
+        <w:rPr>
+          <w:rFonts w:ascii="Times New Roman" w:hAnsi="Times New Roman" w:eastAsia="Times New Roman"/>
+          <w:b/>
+          <w:sz w:val="24"/>
+        </w:rPr>
+        <w:t>7.2. Бюджет на 30 дней и на год</w:t>
       </w:r>
     </w:p>
     <w:tbl>
@@ -2735,7 +3815,7 @@
                 <w:b/>
                 <w:sz w:val="22"/>
               </w:rPr>
-              <w:t>Рекомендуемый тариф</w:t>
+              <w:t>Тариф / объём</w:t>
             </w:r>
           </w:p>
         </w:tc>
@@ -2752,7 +3832,7 @@
                 <w:b/>
                 <w:sz w:val="22"/>
               </w:rPr>
-              <w:t>Оценка, ₽/мес</w:t>
+              <w:t>**₽ за 30 дней**</w:t>
             </w:r>
           </w:p>
         </w:tc>
@@ -2769,7 +3849,7 @@
                 <w:b/>
                 <w:sz w:val="22"/>
               </w:rPr>
-              <w:t>Оценка, ₽/год</w:t>
+              <w:t>**₽ за 12 мес.**</w:t>
             </w:r>
           </w:p>
         </w:tc>
@@ -2787,7 +3867,7 @@
                 <w:b w:val="0"/>
                 <w:sz w:val="20"/>
               </w:rPr>
-              <w:t>VPS в РФ (2 vCPU / 2 ГБ RAM / 20+ ГБ)</w:t>
+              <w:t>VPS РФ (1 vCPU / 1 ГБ / 10–15 ГБ)</w:t>
             </w:r>
           </w:p>
         </w:tc>
@@ -2803,7 +3883,7 @@
                 <w:b w:val="0"/>
                 <w:sz w:val="20"/>
               </w:rPr>
-              <w:t>SpaceWeb, Beget, Timeweb, Selectel и аналоги</w:t>
+              <w:t>SpaceWeb, Beget, Timeweb и аналоги</w:t>
             </w:r>
           </w:p>
         </w:tc>
@@ -2819,7 +3899,7 @@
                 <w:b w:val="0"/>
                 <w:sz w:val="20"/>
               </w:rPr>
-              <w:t>800 – 1 500</w:t>
+              <w:t>500 – 800</w:t>
             </w:r>
           </w:p>
         </w:tc>
@@ -2835,7 +3915,7 @@
                 <w:b w:val="0"/>
                 <w:sz w:val="20"/>
               </w:rPr>
-              <w:t>9 600 – 18 000</w:t>
+              <w:t>6 000 – 9 600</w:t>
             </w:r>
           </w:p>
         </w:tc>
@@ -2853,7 +3933,7 @@
                 <w:b w:val="0"/>
                 <w:sz w:val="20"/>
               </w:rPr>
-              <w:t>Прокси РФ (пакет ~10 ГБ, резидентские/ISP)</w:t>
+              <w:t>Прокси РФ</w:t>
             </w:r>
           </w:p>
         </w:tc>
@@ -2869,7 +3949,7 @@
                 <w:b w:val="0"/>
                 <w:sz w:val="20"/>
               </w:rPr>
-              <w:t>Proxy.Market и аналоги</w:t>
+              <w:t>1–2 ГБ трафика (резидентские/ISP)</w:t>
             </w:r>
           </w:p>
         </w:tc>
@@ -2885,7 +3965,7 @@
                 <w:b w:val="0"/>
                 <w:sz w:val="20"/>
               </w:rPr>
-              <w:t>2 000 – 3 500</w:t>
+              <w:t>350 – 700</w:t>
             </w:r>
           </w:p>
         </w:tc>
@@ -2901,7 +3981,7 @@
                 <w:b w:val="0"/>
                 <w:sz w:val="20"/>
               </w:rPr>
-              <w:t>24 000 – 42 000</w:t>
+              <w:t>4 200 – 8 400</w:t>
             </w:r>
           </w:p>
         </w:tc>
@@ -2935,7 +4015,7 @@
                 <w:b w:val="0"/>
                 <w:sz w:val="20"/>
               </w:rPr>
-              <w:t>RuCaptcha / 2captcha, баланс API</w:t>
+              <w:t>RuCaptcha / 2captcha</w:t>
             </w:r>
           </w:p>
         </w:tc>
@@ -2951,7 +4031,7 @@
                 <w:b w:val="0"/>
                 <w:sz w:val="20"/>
               </w:rPr>
-              <w:t>300 – 1 500</w:t>
+              <w:t>150 – 400</w:t>
             </w:r>
           </w:p>
         </w:tc>
@@ -2967,7 +4047,7 @@
                 <w:b w:val="0"/>
                 <w:sz w:val="20"/>
               </w:rPr>
-              <w:t>3 600 – 18 000</w:t>
+              <w:t>1 800 – 4 800</w:t>
             </w:r>
           </w:p>
         </w:tc>
@@ -2985,7 +4065,7 @@
                 <w:b w:val="0"/>
                 <w:sz w:val="20"/>
               </w:rPr>
-              <w:t>**Итого инфраструктура**</w:t>
+              <w:t>**Итого**</w:t>
             </w:r>
           </w:p>
         </w:tc>
@@ -3016,7 +4096,7 @@
                 <w:b w:val="0"/>
                 <w:sz w:val="20"/>
               </w:rPr>
-              <w:t>**3 100 – 6 500**</w:t>
+              <w:t>**1 000 – 1 900**</w:t>
             </w:r>
           </w:p>
         </w:tc>
@@ -3032,7 +4112,7 @@
                 <w:b w:val="0"/>
                 <w:sz w:val="20"/>
               </w:rPr>
-              <w:t>**37 200 – 78 000**</w:t>
+              <w:t>**12 000 – 22 800**</w:t>
             </w:r>
           </w:p>
         </w:tc>
@@ -3041,7 +4121,7 @@
     <w:p/>
     <w:p>
       <w:pPr>
-        <w:spacing w:before="240" w:after="120"/>
+        <w:spacing w:after="120" w:line="276" w:lineRule="auto"/>
       </w:pPr>
       <w:r>
         <w:rPr>
@@ -3049,7 +4129,60 @@
           <w:b/>
           <w:sz w:val="24"/>
         </w:rPr>
-        <w:t>7.2. Расходы, которые обычно уже есть у клиента</w:t>
+        <w:t>Рабочий ориентир для КП:</w:t>
+      </w:r>
+      <w:r>
+        <w:rPr>
+          <w:rFonts w:ascii="Times New Roman" w:hAnsi="Times New Roman" w:eastAsia="Times New Roman"/>
+          <w:b w:val="0"/>
+          <w:sz w:val="24"/>
+        </w:rPr>
+        <w:t xml:space="preserve"> ≈ </w:t>
+      </w:r>
+      <w:r>
+        <w:rPr>
+          <w:rFonts w:ascii="Times New Roman" w:hAnsi="Times New Roman" w:eastAsia="Times New Roman"/>
+          <w:b/>
+          <w:sz w:val="24"/>
+        </w:rPr>
+        <w:t>1 400 ₽/мес</w:t>
+      </w:r>
+      <w:r>
+        <w:rPr>
+          <w:rFonts w:ascii="Times New Roman" w:hAnsi="Times New Roman" w:eastAsia="Times New Roman"/>
+          <w:b w:val="0"/>
+          <w:sz w:val="24"/>
+        </w:rPr>
+        <w:t xml:space="preserve"> → ≈ </w:t>
+      </w:r>
+      <w:r>
+        <w:rPr>
+          <w:rFonts w:ascii="Times New Roman" w:hAnsi="Times New Roman" w:eastAsia="Times New Roman"/>
+          <w:b/>
+          <w:sz w:val="24"/>
+        </w:rPr>
+        <w:t>17 000 ₽/год</w:t>
+      </w:r>
+      <w:r>
+        <w:rPr>
+          <w:rFonts w:ascii="Times New Roman" w:hAnsi="Times New Roman" w:eastAsia="Times New Roman"/>
+          <w:b w:val="0"/>
+          <w:sz w:val="24"/>
+        </w:rPr>
+        <w:t>.</w:t>
+      </w:r>
+    </w:p>
+    <w:p>
+      <w:pPr>
+        <w:spacing w:before="240" w:after="120"/>
+      </w:pPr>
+      <w:r>
+        <w:rPr>
+          <w:rFonts w:ascii="Times New Roman" w:hAnsi="Times New Roman" w:eastAsia="Times New Roman"/>
+          <w:b/>
+          <w:sz w:val="24"/>
+        </w:rPr>
+        <w:t>7.3. Что уже есть у клиента</w:t>
       </w:r>
     </w:p>
     <w:tbl>
@@ -3127,41 +4260,7 @@
                 <w:b w:val="0"/>
                 <w:sz w:val="20"/>
               </w:rPr>
-              <w:t>оплачивается по тарифу портала клиента; отдельная лицензия под «БитриксЮрист» не требуется</w:t>
-            </w:r>
-          </w:p>
-        </w:tc>
-      </w:tr>
-      <w:tr>
-        <w:tc>
-          <w:tcPr>
-            <w:tcW w:type="dxa" w:w="4844"/>
-          </w:tcPr>
-          <w:p>
-            <w:r/>
-            <w:r>
-              <w:rPr>
-                <w:rFonts w:ascii="Times New Roman" w:hAnsi="Times New Roman" w:eastAsia="Times New Roman"/>
-                <w:b w:val="0"/>
-                <w:sz w:val="20"/>
-              </w:rPr>
-              <w:t>Рабочие места сотрудников</w:t>
-            </w:r>
-          </w:p>
-        </w:tc>
-        <w:tc>
-          <w:tcPr>
-            <w:tcW w:type="dxa" w:w="4844"/>
-          </w:tcPr>
-          <w:p>
-            <w:r/>
-            <w:r>
-              <w:rPr>
-                <w:rFonts w:ascii="Times New Roman" w:hAnsi="Times New Roman" w:eastAsia="Times New Roman"/>
-                <w:b w:val="0"/>
-                <w:sz w:val="20"/>
-              </w:rPr>
-              <w:t>без изменений</w:t>
+              <w:t>по тарифу портала клиента; отдельная лицензия под систему не нужна</w:t>
             </w:r>
           </w:p>
         </w:tc>
@@ -3178,7 +4277,7 @@
           <w:b/>
           <w:sz w:val="24"/>
         </w:rPr>
-        <w:t>7.3. Разовые расходы на внедрение</w:t>
+        <w:t>7.4. Разовые расходы на внедрение</w:t>
       </w:r>
     </w:p>
     <w:tbl>
@@ -3240,7 +4339,7 @@
                 <w:b w:val="0"/>
                 <w:sz w:val="20"/>
               </w:rPr>
-              <w:t>Установка и настройка на VPS клиента</w:t>
+              <w:t>Установка и настройка на VPS</w:t>
             </w:r>
           </w:p>
         </w:tc>
@@ -3274,7 +4373,7 @@
                 <w:b w:val="0"/>
                 <w:sz w:val="20"/>
               </w:rPr>
-              <w:t>Создание полей/вебхука в Битрикс24</w:t>
+              <w:t>Поля и вебхук в Битрикс24</w:t>
             </w:r>
           </w:p>
         </w:tc>
@@ -3290,7 +4389,7 @@
                 <w:b w:val="0"/>
                 <w:sz w:val="20"/>
               </w:rPr>
-              <w:t>0,5–1 рабочий день (со стороны клиента или исполнителя)</w:t>
+              <w:t>0,5–1 рабочий день</w:t>
             </w:r>
           </w:p>
         </w:tc>
@@ -3308,7 +4407,7 @@
                 <w:b w:val="0"/>
                 <w:sz w:val="20"/>
               </w:rPr>
-              <w:t>Приёмочные испытания</w:t>
+              <w:t>Приёмка</w:t>
             </w:r>
           </w:p>
         </w:tc>
@@ -3333,19 +4432,6 @@
     <w:p/>
     <w:p>
       <w:pPr>
-        <w:spacing w:after="120" w:line="276" w:lineRule="auto"/>
-      </w:pPr>
-      <w:r>
-        <w:rPr>
-          <w:rFonts w:ascii="Times New Roman" w:hAnsi="Times New Roman" w:eastAsia="Times New Roman"/>
-          <w:b w:val="0"/>
-          <w:sz w:val="24"/>
-        </w:rPr>
-        <w:t>Стоимость работ внедрения в данный документ не включена — фиксируется в коммерческом предложении.</w:t>
-      </w:r>
-    </w:p>
-    <w:p>
-      <w:pPr>
         <w:spacing w:before="240" w:after="120"/>
       </w:pPr>
       <w:r>
@@ -3354,265 +4440,7 @@
           <w:b/>
           <w:sz w:val="24"/>
         </w:rPr>
-        <w:t>7.4. Сценарии нагрузки (влияние на бюджет)</w:t>
-      </w:r>
-    </w:p>
-    <w:tbl>
-      <w:tblPr>
-        <w:tblStyle w:val="TableGrid"/>
-        <w:tblW w:type="auto" w:w="0"/>
-        <w:tblLook w:firstColumn="1" w:firstRow="1" w:lastColumn="0" w:lastRow="0" w:noHBand="0" w:noVBand="1" w:val="04A0"/>
-      </w:tblPr>
-      <w:tblGrid>
-        <w:gridCol w:w="3230"/>
-        <w:gridCol w:w="3230"/>
-        <w:gridCol w:w="3230"/>
-      </w:tblGrid>
-      <w:tr>
-        <w:tc>
-          <w:tcPr>
-            <w:tcW w:type="dxa" w:w="3230"/>
-            <w:shd w:fill="D9E2F3" w:val="clear"/>
-          </w:tcPr>
-          <w:p>
-            <w:r/>
-            <w:r>
-              <w:rPr>
-                <w:rFonts w:ascii="Times New Roman" w:hAnsi="Times New Roman" w:eastAsia="Times New Roman"/>
-                <w:b/>
-                <w:sz w:val="22"/>
-              </w:rPr>
-              <w:t>Нагрузка</w:t>
-            </w:r>
-          </w:p>
-        </w:tc>
-        <w:tc>
-          <w:tcPr>
-            <w:tcW w:type="dxa" w:w="3230"/>
-            <w:shd w:fill="D9E2F3" w:val="clear"/>
-          </w:tcPr>
-          <w:p>
-            <w:r/>
-            <w:r>
-              <w:rPr>
-                <w:rFonts w:ascii="Times New Roman" w:hAnsi="Times New Roman" w:eastAsia="Times New Roman"/>
-                <w:b/>
-                <w:sz w:val="22"/>
-              </w:rPr>
-              <w:t>Ориентир</w:t>
-            </w:r>
-          </w:p>
-        </w:tc>
-        <w:tc>
-          <w:tcPr>
-            <w:tcW w:type="dxa" w:w="3230"/>
-            <w:shd w:fill="D9E2F3" w:val="clear"/>
-          </w:tcPr>
-          <w:p>
-            <w:r/>
-            <w:r>
-              <w:rPr>
-                <w:rFonts w:ascii="Times New Roman" w:hAnsi="Times New Roman" w:eastAsia="Times New Roman"/>
-                <w:b/>
-                <w:sz w:val="22"/>
-              </w:rPr>
-              <w:t>Что растёт</w:t>
-            </w:r>
-          </w:p>
-        </w:tc>
-      </w:tr>
-      <w:tr>
-        <w:tc>
-          <w:tcPr>
-            <w:tcW w:type="dxa" w:w="3230"/>
-          </w:tcPr>
-          <w:p>
-            <w:r/>
-            <w:r>
-              <w:rPr>
-                <w:rFonts w:ascii="Times New Roman" w:hAnsi="Times New Roman" w:eastAsia="Times New Roman"/>
-                <w:b w:val="0"/>
-                <w:sz w:val="20"/>
-              </w:rPr>
-              <w:t>До 50 сделок/сутки</w:t>
-            </w:r>
-          </w:p>
-        </w:tc>
-        <w:tc>
-          <w:tcPr>
-            <w:tcW w:type="dxa" w:w="3230"/>
-          </w:tcPr>
-          <w:p>
-            <w:r/>
-            <w:r>
-              <w:rPr>
-                <w:rFonts w:ascii="Times New Roman" w:hAnsi="Times New Roman" w:eastAsia="Times New Roman"/>
-                <w:b w:val="0"/>
-                <w:sz w:val="20"/>
-              </w:rPr>
-              <w:t>нижняя граница таблицы 7.1</w:t>
-            </w:r>
-          </w:p>
-        </w:tc>
-        <w:tc>
-          <w:tcPr>
-            <w:tcW w:type="dxa" w:w="3230"/>
-          </w:tcPr>
-          <w:p>
-            <w:r/>
-            <w:r>
-              <w:rPr>
-                <w:rFonts w:ascii="Times New Roman" w:hAnsi="Times New Roman" w:eastAsia="Times New Roman"/>
-                <w:b w:val="0"/>
-                <w:sz w:val="20"/>
-              </w:rPr>
-              <w:t>минимальный расход капчи и прокси</w:t>
-            </w:r>
-          </w:p>
-        </w:tc>
-      </w:tr>
-      <w:tr>
-        <w:tc>
-          <w:tcPr>
-            <w:tcW w:type="dxa" w:w="3230"/>
-          </w:tcPr>
-          <w:p>
-            <w:r/>
-            <w:r>
-              <w:rPr>
-                <w:rFonts w:ascii="Times New Roman" w:hAnsi="Times New Roman" w:eastAsia="Times New Roman"/>
-                <w:b w:val="0"/>
-                <w:sz w:val="20"/>
-              </w:rPr>
-              <w:t>50–200 сделок/сутки</w:t>
-            </w:r>
-          </w:p>
-        </w:tc>
-        <w:tc>
-          <w:tcPr>
-            <w:tcW w:type="dxa" w:w="3230"/>
-          </w:tcPr>
-          <w:p>
-            <w:r/>
-            <w:r>
-              <w:rPr>
-                <w:rFonts w:ascii="Times New Roman" w:hAnsi="Times New Roman" w:eastAsia="Times New Roman"/>
-                <w:b w:val="0"/>
-                <w:sz w:val="20"/>
-              </w:rPr>
-              <w:t>середина диапазона</w:t>
-            </w:r>
-          </w:p>
-        </w:tc>
-        <w:tc>
-          <w:tcPr>
-            <w:tcW w:type="dxa" w:w="3230"/>
-          </w:tcPr>
-          <w:p>
-            <w:r/>
-            <w:r>
-              <w:rPr>
-                <w:rFonts w:ascii="Times New Roman" w:hAnsi="Times New Roman" w:eastAsia="Times New Roman"/>
-                <w:b w:val="0"/>
-                <w:sz w:val="20"/>
-              </w:rPr>
-              <w:t>порты прокси, баланс капчи</w:t>
-            </w:r>
-          </w:p>
-        </w:tc>
-      </w:tr>
-      <w:tr>
-        <w:tc>
-          <w:tcPr>
-            <w:tcW w:type="dxa" w:w="3230"/>
-          </w:tcPr>
-          <w:p>
-            <w:r/>
-            <w:r>
-              <w:rPr>
-                <w:rFonts w:ascii="Times New Roman" w:hAnsi="Times New Roman" w:eastAsia="Times New Roman"/>
-                <w:b w:val="0"/>
-                <w:sz w:val="20"/>
-              </w:rPr>
-              <w:t>200+ сделок/сутки</w:t>
-            </w:r>
-          </w:p>
-        </w:tc>
-        <w:tc>
-          <w:tcPr>
-            <w:tcW w:type="dxa" w:w="3230"/>
-          </w:tcPr>
-          <w:p>
-            <w:r/>
-            <w:r>
-              <w:rPr>
-                <w:rFonts w:ascii="Times New Roman" w:hAnsi="Times New Roman" w:eastAsia="Times New Roman"/>
-                <w:b w:val="0"/>
-                <w:sz w:val="20"/>
-              </w:rPr>
-              <w:t>верхняя граница / выше</w:t>
-            </w:r>
-          </w:p>
-        </w:tc>
-        <w:tc>
-          <w:tcPr>
-            <w:tcW w:type="dxa" w:w="3230"/>
-          </w:tcPr>
-          <w:p>
-            <w:r/>
-            <w:r>
-              <w:rPr>
-                <w:rFonts w:ascii="Times New Roman" w:hAnsi="Times New Roman" w:eastAsia="Times New Roman"/>
-                <w:b w:val="0"/>
-                <w:sz w:val="20"/>
-              </w:rPr>
-              <w:t>VPS 4 ГБ, пакет прокси 50 ГБ, запас капчи</w:t>
-            </w:r>
-          </w:p>
-        </w:tc>
-      </w:tr>
-    </w:tbl>
-    <w:p/>
-    <w:p>
-      <w:pPr>
-        <w:spacing w:before="240" w:after="120"/>
-      </w:pPr>
-      <w:r>
-        <w:rPr>
-          <w:rFonts w:ascii="Times New Roman" w:hAnsi="Times New Roman" w:eastAsia="Times New Roman"/>
-          <w:b/>
-          <w:sz w:val="24"/>
-        </w:rPr>
-        <w:t>7.5. Пример годового бюджета инфраструктуры (типовой офис)</w:t>
-      </w:r>
-    </w:p>
-    <w:p>
-      <w:pPr>
-        <w:spacing w:after="120" w:line="276" w:lineRule="auto"/>
-      </w:pPr>
-      <w:r>
-        <w:rPr>
-          <w:rFonts w:ascii="Times New Roman" w:hAnsi="Times New Roman" w:eastAsia="Times New Roman"/>
-          <w:b w:val="0"/>
-          <w:sz w:val="24"/>
-        </w:rPr>
-        <w:t xml:space="preserve">Для практики с </w:t>
-      </w:r>
-      <w:r>
-        <w:rPr>
-          <w:rFonts w:ascii="Times New Roman" w:hAnsi="Times New Roman" w:eastAsia="Times New Roman"/>
-          <w:b/>
-          <w:sz w:val="24"/>
-        </w:rPr>
-        <w:t>до ~100 проверяемых дел в сутки</w:t>
-      </w:r>
-      <w:r>
-        <w:rPr>
-          <w:rFonts w:ascii="Times New Roman" w:hAnsi="Times New Roman" w:eastAsia="Times New Roman"/>
-          <w:b w:val="0"/>
-          <w:sz w:val="24"/>
-        </w:rPr>
-        <w:t>:</w:t>
+        <w:t>7.5. Если дел станет больше</w:t>
       </w:r>
     </w:p>
     <w:tbl>
@@ -3639,7 +4467,7 @@
                 <w:b/>
                 <w:sz w:val="22"/>
               </w:rPr>
-              <w:t>Статья</w:t>
+              <w:t>Нагрузка</w:t>
             </w:r>
           </w:p>
         </w:tc>
@@ -3656,7 +4484,7 @@
                 <w:b/>
                 <w:sz w:val="22"/>
               </w:rPr>
-              <w:t>В год, ₽</w:t>
+              <w:t>Что меняется в бюджете</w:t>
             </w:r>
           </w:p>
         </w:tc>
@@ -3674,7 +4502,7 @@
                 <w:b w:val="0"/>
                 <w:sz w:val="20"/>
               </w:rPr>
-              <w:t>VPS</w:t>
+              <w:t>50 дел/сутки</w:t>
             </w:r>
           </w:p>
         </w:tc>
@@ -3690,7 +4518,7 @@
                 <w:b w:val="0"/>
                 <w:sz w:val="20"/>
               </w:rPr>
-              <w:t>≈ 12 000</w:t>
+              <w:t>примерно вдвое меньше прокси и капчи</w:t>
             </w:r>
           </w:p>
         </w:tc>
@@ -3708,7 +4536,7 @@
                 <w:b w:val="0"/>
                 <w:sz w:val="20"/>
               </w:rPr>
-              <w:t>Прокси</w:t>
+              <w:t>100 дел/сутки</w:t>
             </w:r>
           </w:p>
         </w:tc>
@@ -3724,7 +4552,7 @@
                 <w:b w:val="0"/>
                 <w:sz w:val="20"/>
               </w:rPr>
-              <w:t>≈ 30 000</w:t>
+              <w:t>таблица 7.2</w:t>
             </w:r>
           </w:p>
         </w:tc>
@@ -3742,7 +4570,7 @@
                 <w:b w:val="0"/>
                 <w:sz w:val="20"/>
               </w:rPr>
-              <w:t>Капча</w:t>
+              <w:t>300+ дел/сутки</w:t>
             </w:r>
           </w:p>
         </w:tc>
@@ -3758,60 +4586,13 @@
                 <w:b w:val="0"/>
                 <w:sz w:val="20"/>
               </w:rPr>
-              <w:t>≈ 8 000</w:t>
-            </w:r>
-          </w:p>
-        </w:tc>
-      </w:tr>
-      <w:tr>
-        <w:tc>
-          <w:tcPr>
-            <w:tcW w:type="dxa" w:w="4844"/>
-          </w:tcPr>
-          <w:p>
-            <w:r/>
-            <w:r>
-              <w:rPr>
-                <w:rFonts w:ascii="Times New Roman" w:hAnsi="Times New Roman" w:eastAsia="Times New Roman"/>
-                <w:b w:val="0"/>
-                <w:sz w:val="20"/>
-              </w:rPr>
-              <w:t>**Итого**</w:t>
-            </w:r>
-          </w:p>
-        </w:tc>
-        <w:tc>
-          <w:tcPr>
-            <w:tcW w:type="dxa" w:w="4844"/>
-          </w:tcPr>
-          <w:p>
-            <w:r/>
-            <w:r>
-              <w:rPr>
-                <w:rFonts w:ascii="Times New Roman" w:hAnsi="Times New Roman" w:eastAsia="Times New Roman"/>
-                <w:b w:val="0"/>
-                <w:sz w:val="20"/>
-              </w:rPr>
-              <w:t>**≈ 50 000 ₽ / год**</w:t>
+              <w:t>прокси 3–5 ГБ/мес, капча пропорционально; VPS по-прежнему часто хватает 1 ГБ</w:t>
             </w:r>
           </w:p>
         </w:tc>
       </w:tr>
     </w:tbl>
     <w:p/>
-    <w:p>
-      <w:pPr>
-        <w:spacing w:after="120" w:line="276" w:lineRule="auto"/>
-      </w:pPr>
-      <w:r>
-        <w:rPr>
-          <w:rFonts w:ascii="Times New Roman" w:hAnsi="Times New Roman" w:eastAsia="Times New Roman"/>
-          <w:b w:val="0"/>
-          <w:sz w:val="24"/>
-        </w:rPr>
-        <w:t>Плюс работы по внедрению и (по желанию) абонентское сопровождение.</w:t>
-      </w:r>
-    </w:p>
     <w:p>
       <w:pPr>
         <w:spacing w:before="240" w:after="120"/>
@@ -3874,7 +4655,7 @@
           <w:b w:val="0"/>
           <w:sz w:val="24"/>
         </w:rPr>
-        <w:t>3. По мере изменений на сайтах судов — устанавливать обновления парсера (патчи поставляет исполнитель).</w:t>
+        <w:t>3. По мере изменений на сайтах судов — устанавливать обновления парсера.</w:t>
       </w:r>
     </w:p>
     <w:p>
@@ -3904,7 +4685,7 @@
       </w:r>
       <w:r>
         <w:rPr>
-          <w:rFonts w:ascii="Courier New" w:hAnsi="Courier New" w:eastAsia="Times New Roman"/>
+          <w:rFonts w:ascii="Courier New" w:hAnsi="Courier New" w:eastAsia="Courier New"/>
           <w:b w:val="0"/>
           <w:sz w:val="22"/>
         </w:rPr>
@@ -3916,15 +4697,28 @@
           <w:b w:val="0"/>
           <w:sz w:val="24"/>
         </w:rPr>
-        <w:t xml:space="preserve"> и каталогов </w:t>
+        <w:t xml:space="preserve"> (без публикации секретов).</w:t>
+      </w:r>
+    </w:p>
+    <w:p>
+      <w:pPr>
+        <w:spacing w:after="120" w:line="276" w:lineRule="auto"/>
+      </w:pPr>
+      <w:r>
+        <w:rPr>
+          <w:rFonts w:ascii="Times New Roman" w:hAnsi="Times New Roman" w:eastAsia="Times New Roman"/>
+          <w:b w:val="0"/>
+          <w:sz w:val="24"/>
+        </w:rPr>
+        <w:t xml:space="preserve">Сырые ответы сайтов судов на диск </w:t>
       </w:r>
       <w:r>
         <w:rPr>
-          <w:rFonts w:ascii="Courier New" w:hAnsi="Courier New" w:eastAsia="Times New Roman"/>
-          <w:b w:val="0"/>
-          <w:sz w:val="22"/>
+          <w:rFonts w:ascii="Times New Roman" w:hAnsi="Times New Roman" w:eastAsia="Times New Roman"/>
+          <w:b/>
+          <w:sz w:val="24"/>
         </w:rPr>
-        <w:t>/opt/bitrix-delo</w:t>
+        <w:t>не обязаны</w:t>
       </w:r>
       <w:r>
         <w:rPr>
@@ -3932,15 +4726,28 @@
           <w:b w:val="0"/>
           <w:sz w:val="24"/>
         </w:rPr>
-        <w:t xml:space="preserve">, </w:t>
+        <w:t xml:space="preserve"> храниться: всё нужное уже в Битрикс24.</w:t>
+      </w:r>
+    </w:p>
+    <w:p>
+      <w:pPr>
+        <w:spacing w:after="120" w:line="276" w:lineRule="auto"/>
+      </w:pPr>
+      <w:r>
+        <w:rPr>
+          <w:rFonts w:ascii="Times New Roman" w:hAnsi="Times New Roman" w:eastAsia="Times New Roman"/>
+          <w:b w:val="0"/>
+          <w:sz w:val="24"/>
+        </w:rPr>
+        <w:t xml:space="preserve">При желании можно включить ротационный кэш на </w:t>
       </w:r>
       <w:r>
         <w:rPr>
-          <w:rFonts w:ascii="Courier New" w:hAnsi="Courier New" w:eastAsia="Times New Roman"/>
-          <w:b w:val="0"/>
-          <w:sz w:val="22"/>
+          <w:rFonts w:ascii="Times New Roman" w:hAnsi="Times New Roman" w:eastAsia="Times New Roman"/>
+          <w:b/>
+          <w:sz w:val="24"/>
         </w:rPr>
-        <w:t>/opt/bitrix-yurist</w:t>
+        <w:t>7 дней</w:t>
       </w:r>
       <w:r>
         <w:rPr>
@@ -3948,7 +4755,7 @@
           <w:b w:val="0"/>
           <w:sz w:val="24"/>
         </w:rPr>
-        <w:t xml:space="preserve"> (без публикации секретов).</w:t>
+        <w:t xml:space="preserve"> с автоперезаписью — только для разбора сбоев, не для учёта дел.</w:t>
       </w:r>
     </w:p>
     <w:p>
@@ -3961,7 +4768,7 @@
           <w:b w:val="0"/>
           <w:sz w:val="24"/>
         </w:rPr>
-        <w:t>Абонентское сопровождение (реакция на сбои, обновления, консультации) оформляется отдельным соглашением.</w:t>
+        <w:t>Абонентское сопровождение оформляется отдельным соглашением.</w:t>
       </w:r>
     </w:p>
     <w:p>
@@ -4388,7 +5195,7 @@
       </w:r>
       <w:r>
         <w:rPr>
-          <w:rFonts w:ascii="Courier New" w:hAnsi="Courier New" w:eastAsia="Times New Roman"/>
+          <w:rFonts w:ascii="Courier New" w:hAnsi="Courier New" w:eastAsia="Courier New"/>
           <w:b w:val="0"/>
           <w:sz w:val="22"/>
         </w:rPr>
@@ -4417,7 +5224,7 @@
       </w:r>
       <w:r>
         <w:rPr>
-          <w:rFonts w:ascii="Courier New" w:hAnsi="Courier New" w:eastAsia="Times New Roman"/>
+          <w:rFonts w:ascii="Courier New" w:hAnsi="Courier New" w:eastAsia="Courier New"/>
           <w:b w:val="0"/>
           <w:sz w:val="22"/>
         </w:rPr>

</xml_diff>

<commit_message>
Schedule BitrixЮрист daily run at 08:00 MSK.
Co-authored-by: dier55555-cpu <dier55555-cpu@users.noreply.github.com>
</commit_message>
<xml_diff>
--- a/БитриксЮрист/ТЗ-БитриксЮрист.docx
+++ b/БитриксЮрист/ТЗ-БитриксЮрист.docx
@@ -31,7 +31,7 @@
     </w:p>
     <w:p>
       <w:pPr>
-        <w:spacing w:after="120" w:line="276" w:lineRule="auto"/>
+        <w:spacing w:after="120"/>
       </w:pPr>
       <w:r>
         <w:rPr>
@@ -52,7 +52,7 @@
     </w:p>
     <w:p>
       <w:pPr>
-        <w:spacing w:after="120" w:line="276" w:lineRule="auto"/>
+        <w:spacing w:after="120"/>
       </w:pPr>
       <w:r>
         <w:rPr>
@@ -73,7 +73,7 @@
     </w:p>
     <w:p>
       <w:pPr>
-        <w:spacing w:after="120" w:line="276" w:lineRule="auto"/>
+        <w:spacing w:after="120"/>
       </w:pPr>
       <w:r>
         <w:rPr>
@@ -120,7 +120,7 @@
     </w:p>
     <w:p>
       <w:pPr>
-        <w:spacing w:after="120" w:line="276" w:lineRule="auto"/>
+        <w:spacing w:after="120"/>
       </w:pPr>
       <w:r>
         <w:rPr>
@@ -146,7 +146,7 @@
     </w:p>
     <w:p>
       <w:pPr>
-        <w:spacing w:after="120" w:line="276" w:lineRule="auto"/>
+        <w:spacing w:after="120"/>
       </w:pPr>
       <w:r>
         <w:rPr>
@@ -158,9 +158,6 @@
       </w:r>
     </w:p>
     <w:p>
-      <w:pPr>
-        <w:ind w:left="283"/>
-      </w:pPr>
       <w:r>
         <w:rPr>
           <w:rFonts w:ascii="Courier New" w:hAnsi="Courier New" w:eastAsia="Courier New"/>
@@ -182,7 +179,7 @@
     </w:p>
     <w:p>
       <w:pPr>
-        <w:spacing w:after="120" w:line="276" w:lineRule="auto"/>
+        <w:spacing w:after="120"/>
       </w:pPr>
       <w:r>
         <w:rPr>
@@ -208,7 +205,7 @@
     </w:p>
     <w:p>
       <w:pPr>
-        <w:spacing w:after="120" w:line="276" w:lineRule="auto"/>
+        <w:spacing w:after="120"/>
       </w:pPr>
       <w:r>
         <w:rPr>
@@ -221,7 +218,7 @@
     </w:p>
     <w:p>
       <w:pPr>
-        <w:spacing w:after="120" w:line="276" w:lineRule="auto"/>
+        <w:spacing w:after="120"/>
       </w:pPr>
       <w:r>
         <w:rPr>
@@ -234,7 +231,7 @@
     </w:p>
     <w:p>
       <w:pPr>
-        <w:spacing w:after="120" w:line="276" w:lineRule="auto"/>
+        <w:spacing w:after="120"/>
       </w:pPr>
       <w:r>
         <w:rPr>
@@ -247,7 +244,7 @@
     </w:p>
     <w:p>
       <w:pPr>
-        <w:spacing w:after="120" w:line="276" w:lineRule="auto"/>
+        <w:spacing w:after="120"/>
       </w:pPr>
       <w:r>
         <w:rPr>
@@ -260,7 +257,7 @@
     </w:p>
     <w:p>
       <w:pPr>
-        <w:spacing w:after="120" w:line="276" w:lineRule="auto"/>
+        <w:spacing w:after="120"/>
       </w:pPr>
       <w:r>
         <w:rPr>
@@ -286,7 +283,7 @@
     </w:p>
     <w:p>
       <w:pPr>
-        <w:spacing w:after="120" w:line="276" w:lineRule="auto"/>
+        <w:spacing w:after="120"/>
       </w:pPr>
       <w:r>
         <w:rPr>
@@ -299,7 +296,7 @@
     </w:p>
     <w:p>
       <w:pPr>
-        <w:spacing w:after="120" w:line="276" w:lineRule="auto"/>
+        <w:spacing w:after="120"/>
       </w:pPr>
       <w:r>
         <w:rPr>
@@ -312,7 +309,7 @@
     </w:p>
     <w:p>
       <w:pPr>
-        <w:spacing w:after="120" w:line="276" w:lineRule="auto"/>
+        <w:spacing w:after="120"/>
       </w:pPr>
       <w:r>
         <w:rPr>
@@ -325,7 +322,7 @@
     </w:p>
     <w:p>
       <w:pPr>
-        <w:spacing w:after="120" w:line="276" w:lineRule="auto"/>
+        <w:spacing w:after="120"/>
       </w:pPr>
       <w:r>
         <w:rPr>
@@ -526,7 +523,7 @@
                 <w:b w:val="0"/>
                 <w:sz w:val="20"/>
               </w:rPr>
-              <w:t>Ежедневный запуск (по умолчанию 06:00 МСК)</w:t>
+              <w:t>Ежедневный запуск (по умолчанию 08:00 МСК)</w:t>
             </w:r>
           </w:p>
         </w:tc>
@@ -569,7 +566,7 @@
     <w:p/>
     <w:p>
       <w:pPr>
-        <w:spacing w:after="120" w:line="276" w:lineRule="auto"/>
+        <w:spacing w:after="120"/>
       </w:pPr>
       <w:r>
         <w:rPr>
@@ -597,9 +594,6 @@
       </w:r>
     </w:p>
     <w:p>
-      <w:pPr>
-        <w:ind w:left="283"/>
-      </w:pPr>
       <w:r>
         <w:rPr>
           <w:rFonts w:ascii="Courier New" w:hAnsi="Courier New" w:eastAsia="Courier New"/>
@@ -620,7 +614,7 @@
         <w:br/>
         <w:t xml:space="preserve">  ├── Справочник судов</w:t>
         <w:br/>
-        <w:t xml:space="preserve">  └── Битрикс-агент + таймер 06:00 МСК</w:t>
+        <w:t xml:space="preserve">  └── Битрикс-агент + таймер 08:00 МСК</w:t>
         <w:br/>
         <w:t xml:space="preserve">        │</w:t>
         <w:br/>
@@ -657,7 +651,7 @@
     </w:p>
     <w:p>
       <w:pPr>
-        <w:spacing w:after="120" w:line="276" w:lineRule="auto"/>
+        <w:spacing w:after="120"/>
       </w:pPr>
       <w:r>
         <w:rPr>
@@ -683,7 +677,7 @@
     </w:p>
     <w:p>
       <w:pPr>
-        <w:spacing w:after="120" w:line="276" w:lineRule="auto"/>
+        <w:spacing w:after="120"/>
       </w:pPr>
       <w:r>
         <w:rPr>
@@ -696,7 +690,7 @@
     </w:p>
     <w:p>
       <w:pPr>
-        <w:spacing w:after="120" w:line="276" w:lineRule="auto"/>
+        <w:spacing w:after="120"/>
       </w:pPr>
       <w:r>
         <w:rPr>
@@ -725,7 +719,7 @@
     </w:p>
     <w:p>
       <w:pPr>
-        <w:spacing w:after="120" w:line="276" w:lineRule="auto"/>
+        <w:spacing w:after="120"/>
       </w:pPr>
       <w:r>
         <w:rPr>
@@ -767,7 +761,7 @@
     </w:p>
     <w:p>
       <w:pPr>
-        <w:spacing w:after="120" w:line="276" w:lineRule="auto"/>
+        <w:spacing w:after="120"/>
       </w:pPr>
       <w:r>
         <w:rPr>
@@ -1296,7 +1290,7 @@
     <w:p/>
     <w:p>
       <w:pPr>
-        <w:spacing w:after="120" w:line="276" w:lineRule="auto"/>
+        <w:spacing w:after="120"/>
       </w:pPr>
       <w:r>
         <w:rPr>
@@ -1322,7 +1316,7 @@
     </w:p>
     <w:p>
       <w:pPr>
-        <w:spacing w:after="120" w:line="276" w:lineRule="auto"/>
+        <w:spacing w:after="120"/>
       </w:pPr>
       <w:r>
         <w:rPr>
@@ -1351,7 +1345,7 @@
     </w:p>
     <w:p>
       <w:pPr>
-        <w:spacing w:after="120" w:line="276" w:lineRule="auto"/>
+        <w:spacing w:after="120"/>
       </w:pPr>
       <w:r>
         <w:rPr>
@@ -1372,7 +1366,7 @@
     </w:p>
     <w:p>
       <w:pPr>
-        <w:spacing w:after="120" w:line="276" w:lineRule="auto"/>
+        <w:spacing w:after="120"/>
       </w:pPr>
       <w:r>
         <w:rPr>
@@ -1398,7 +1392,7 @@
     </w:p>
     <w:p>
       <w:pPr>
-        <w:spacing w:after="120" w:line="276" w:lineRule="auto"/>
+        <w:spacing w:after="120"/>
       </w:pPr>
       <w:r>
         <w:rPr>
@@ -1411,7 +1405,7 @@
     </w:p>
     <w:p>
       <w:pPr>
-        <w:spacing w:after="120" w:line="276" w:lineRule="auto"/>
+        <w:spacing w:after="120"/>
       </w:pPr>
       <w:r>
         <w:rPr>
@@ -1424,7 +1418,7 @@
     </w:p>
     <w:p>
       <w:pPr>
-        <w:spacing w:after="120" w:line="276" w:lineRule="auto"/>
+        <w:spacing w:after="120"/>
       </w:pPr>
       <w:r>
         <w:rPr>
@@ -1437,7 +1431,7 @@
     </w:p>
     <w:p>
       <w:pPr>
-        <w:spacing w:after="120" w:line="276" w:lineRule="auto"/>
+        <w:spacing w:after="120"/>
       </w:pPr>
       <w:r>
         <w:rPr>
@@ -1476,7 +1470,7 @@
     </w:p>
     <w:p>
       <w:pPr>
-        <w:spacing w:after="120" w:line="276" w:lineRule="auto"/>
+        <w:spacing w:after="120"/>
       </w:pPr>
       <w:r>
         <w:rPr>
@@ -1489,7 +1483,7 @@
     </w:p>
     <w:p>
       <w:pPr>
-        <w:spacing w:after="120" w:line="276" w:lineRule="auto"/>
+        <w:spacing w:after="120"/>
       </w:pPr>
       <w:r>
         <w:rPr>
@@ -1502,7 +1496,7 @@
     </w:p>
     <w:p>
       <w:pPr>
-        <w:spacing w:after="120" w:line="276" w:lineRule="auto"/>
+        <w:spacing w:after="120"/>
       </w:pPr>
       <w:r>
         <w:rPr>
@@ -1831,7 +1825,7 @@
     <w:p/>
     <w:p>
       <w:pPr>
-        <w:spacing w:after="120" w:line="276" w:lineRule="auto"/>
+        <w:spacing w:after="120"/>
       </w:pPr>
       <w:r>
         <w:rPr>
@@ -2273,7 +2267,7 @@
     <w:p/>
     <w:p>
       <w:pPr>
-        <w:spacing w:after="120" w:line="276" w:lineRule="auto"/>
+        <w:spacing w:after="120"/>
       </w:pPr>
       <w:r>
         <w:rPr>
@@ -2331,7 +2325,7 @@
     </w:p>
     <w:p>
       <w:pPr>
-        <w:spacing w:after="120" w:line="276" w:lineRule="auto"/>
+        <w:spacing w:after="120"/>
       </w:pPr>
       <w:r>
         <w:rPr>
@@ -2344,7 +2338,7 @@
     </w:p>
     <w:p>
       <w:pPr>
-        <w:spacing w:after="120" w:line="276" w:lineRule="auto"/>
+        <w:spacing w:after="120"/>
       </w:pPr>
       <w:r>
         <w:rPr>
@@ -2531,7 +2525,7 @@
     <w:p/>
     <w:p>
       <w:pPr>
-        <w:spacing w:after="120" w:line="276" w:lineRule="auto"/>
+        <w:spacing w:after="120"/>
       </w:pPr>
       <w:r>
         <w:rPr>
@@ -2560,7 +2554,7 @@
     </w:p>
     <w:p>
       <w:pPr>
-        <w:spacing w:after="120" w:line="276" w:lineRule="auto"/>
+        <w:spacing w:after="120"/>
       </w:pPr>
       <w:r>
         <w:rPr>
@@ -2573,7 +2567,7 @@
     </w:p>
     <w:p>
       <w:pPr>
-        <w:spacing w:after="120" w:line="276" w:lineRule="auto"/>
+        <w:spacing w:after="120"/>
       </w:pPr>
       <w:r>
         <w:rPr>
@@ -2599,7 +2593,7 @@
     </w:p>
     <w:p>
       <w:pPr>
-        <w:spacing w:after="120" w:line="276" w:lineRule="auto"/>
+        <w:spacing w:after="120"/>
       </w:pPr>
       <w:r>
         <w:rPr>
@@ -2612,7 +2606,7 @@
     </w:p>
     <w:p>
       <w:pPr>
-        <w:spacing w:after="120" w:line="276" w:lineRule="auto"/>
+        <w:spacing w:after="120"/>
       </w:pPr>
       <w:r>
         <w:rPr>
@@ -2757,7 +2751,7 @@
     <w:p/>
     <w:p>
       <w:pPr>
-        <w:spacing w:after="120" w:line="276" w:lineRule="auto"/>
+        <w:spacing w:after="120"/>
       </w:pPr>
       <w:r>
         <w:rPr>
@@ -2783,7 +2777,7 @@
     </w:p>
     <w:p>
       <w:pPr>
-        <w:spacing w:after="120" w:line="276" w:lineRule="auto"/>
+        <w:spacing w:after="120"/>
       </w:pPr>
       <w:r>
         <w:rPr>
@@ -2796,7 +2790,7 @@
     </w:p>
     <w:p>
       <w:pPr>
-        <w:spacing w:after="120" w:line="276" w:lineRule="auto"/>
+        <w:spacing w:after="120"/>
       </w:pPr>
       <w:r>
         <w:rPr>
@@ -2835,7 +2829,7 @@
     </w:p>
     <w:p>
       <w:pPr>
-        <w:spacing w:after="120" w:line="276" w:lineRule="auto"/>
+        <w:spacing w:after="120"/>
       </w:pPr>
       <w:r>
         <w:rPr>
@@ -2848,7 +2842,7 @@
     </w:p>
     <w:p>
       <w:pPr>
-        <w:spacing w:after="120" w:line="276" w:lineRule="auto"/>
+        <w:spacing w:after="120"/>
       </w:pPr>
       <w:r>
         <w:rPr>
@@ -2861,7 +2855,7 @@
     </w:p>
     <w:p>
       <w:pPr>
-        <w:spacing w:after="120" w:line="276" w:lineRule="auto"/>
+        <w:spacing w:after="120"/>
       </w:pPr>
       <w:r>
         <w:rPr>
@@ -2874,7 +2868,7 @@
     </w:p>
     <w:p>
       <w:pPr>
-        <w:spacing w:after="120" w:line="276" w:lineRule="auto"/>
+        <w:spacing w:after="120"/>
       </w:pPr>
       <w:r>
         <w:rPr>
@@ -2887,7 +2881,7 @@
     </w:p>
     <w:p>
       <w:pPr>
-        <w:spacing w:after="120" w:line="276" w:lineRule="auto"/>
+        <w:spacing w:after="120"/>
       </w:pPr>
       <w:r>
         <w:rPr>
@@ -2929,7 +2923,7 @@
     </w:p>
     <w:p>
       <w:pPr>
-        <w:spacing w:after="120" w:line="276" w:lineRule="auto"/>
+        <w:spacing w:after="120"/>
       </w:pPr>
       <w:r>
         <w:rPr>
@@ -2942,7 +2936,7 @@
     </w:p>
     <w:p>
       <w:pPr>
-        <w:spacing w:after="120" w:line="276" w:lineRule="auto"/>
+        <w:spacing w:after="120"/>
       </w:pPr>
       <w:r>
         <w:rPr>
@@ -2955,7 +2949,7 @@
     </w:p>
     <w:p>
       <w:pPr>
-        <w:spacing w:after="120" w:line="276" w:lineRule="auto"/>
+        <w:spacing w:after="120"/>
       </w:pPr>
       <w:r>
         <w:rPr>
@@ -2968,7 +2962,7 @@
     </w:p>
     <w:p>
       <w:pPr>
-        <w:spacing w:after="120" w:line="276" w:lineRule="auto"/>
+        <w:spacing w:after="120"/>
       </w:pPr>
       <w:r>
         <w:rPr>
@@ -2994,7 +2988,7 @@
     </w:p>
     <w:p>
       <w:pPr>
-        <w:spacing w:after="120" w:line="276" w:lineRule="auto"/>
+        <w:spacing w:after="120"/>
       </w:pPr>
       <w:r>
         <w:rPr>
@@ -3007,7 +3001,7 @@
     </w:p>
     <w:p>
       <w:pPr>
-        <w:spacing w:after="120" w:line="276" w:lineRule="auto"/>
+        <w:spacing w:after="120"/>
       </w:pPr>
       <w:r>
         <w:rPr>
@@ -3020,7 +3014,7 @@
     </w:p>
     <w:p>
       <w:pPr>
-        <w:spacing w:after="120" w:line="276" w:lineRule="auto"/>
+        <w:spacing w:after="120"/>
       </w:pPr>
       <w:r>
         <w:rPr>
@@ -3033,7 +3027,7 @@
     </w:p>
     <w:p>
       <w:pPr>
-        <w:spacing w:after="120" w:line="276" w:lineRule="auto"/>
+        <w:spacing w:after="120"/>
       </w:pPr>
       <w:r>
         <w:rPr>
@@ -3059,7 +3053,7 @@
     </w:p>
     <w:p>
       <w:pPr>
-        <w:spacing w:after="120" w:line="276" w:lineRule="auto"/>
+        <w:spacing w:after="120"/>
       </w:pPr>
       <w:r>
         <w:rPr>
@@ -3072,7 +3066,7 @@
     </w:p>
     <w:p>
       <w:pPr>
-        <w:spacing w:after="120" w:line="276" w:lineRule="auto"/>
+        <w:spacing w:after="120"/>
       </w:pPr>
       <w:r>
         <w:rPr>
@@ -3085,7 +3079,7 @@
     </w:p>
     <w:p>
       <w:pPr>
-        <w:spacing w:after="120" w:line="276" w:lineRule="auto"/>
+        <w:spacing w:after="120"/>
       </w:pPr>
       <w:r>
         <w:rPr>
@@ -3098,7 +3092,7 @@
     </w:p>
     <w:p>
       <w:pPr>
-        <w:spacing w:after="120" w:line="276" w:lineRule="auto"/>
+        <w:spacing w:after="120"/>
       </w:pPr>
       <w:r>
         <w:rPr>
@@ -3111,7 +3105,7 @@
     </w:p>
     <w:p>
       <w:pPr>
-        <w:spacing w:after="120" w:line="276" w:lineRule="auto"/>
+        <w:spacing w:after="120"/>
       </w:pPr>
       <w:r>
         <w:rPr>
@@ -3124,7 +3118,7 @@
     </w:p>
     <w:p>
       <w:pPr>
-        <w:spacing w:after="120" w:line="276" w:lineRule="auto"/>
+        <w:spacing w:after="120"/>
       </w:pPr>
       <w:r>
         <w:rPr>
@@ -3137,7 +3131,7 @@
     </w:p>
     <w:p>
       <w:pPr>
-        <w:spacing w:after="120" w:line="276" w:lineRule="auto"/>
+        <w:spacing w:after="120"/>
       </w:pPr>
       <w:r>
         <w:rPr>
@@ -3150,7 +3144,7 @@
     </w:p>
     <w:p>
       <w:pPr>
-        <w:spacing w:after="120" w:line="276" w:lineRule="auto"/>
+        <w:spacing w:after="120"/>
       </w:pPr>
       <w:r>
         <w:rPr>
@@ -3158,7 +3152,7 @@
           <w:b w:val="0"/>
           <w:sz w:val="24"/>
         </w:rPr>
-        <w:t>7. Таймер показывает следующий запуск (06:00 МСК по умолчанию).</w:t>
+        <w:t>7. Таймер показывает следующий запуск (08:00 МСК по умолчанию).</w:t>
       </w:r>
     </w:p>
     <w:p>
@@ -3176,7 +3170,7 @@
     </w:p>
     <w:p>
       <w:pPr>
-        <w:spacing w:after="120" w:line="276" w:lineRule="auto"/>
+        <w:spacing w:after="120"/>
       </w:pPr>
       <w:r>
         <w:rPr>
@@ -3189,7 +3183,7 @@
     </w:p>
     <w:p>
       <w:pPr>
-        <w:spacing w:after="120" w:line="276" w:lineRule="auto"/>
+        <w:spacing w:after="120"/>
       </w:pPr>
       <w:r>
         <w:rPr>
@@ -3202,7 +3196,7 @@
     </w:p>
     <w:p>
       <w:pPr>
-        <w:spacing w:after="120" w:line="276" w:lineRule="auto"/>
+        <w:spacing w:after="120"/>
       </w:pPr>
       <w:r>
         <w:rPr>
@@ -3215,7 +3209,7 @@
     </w:p>
     <w:p>
       <w:pPr>
-        <w:spacing w:after="120" w:line="276" w:lineRule="auto"/>
+        <w:spacing w:after="120"/>
       </w:pPr>
       <w:r>
         <w:rPr>
@@ -3228,7 +3222,7 @@
     </w:p>
     <w:p>
       <w:pPr>
-        <w:spacing w:after="120" w:line="276" w:lineRule="auto"/>
+        <w:spacing w:after="120"/>
       </w:pPr>
       <w:r>
         <w:rPr>
@@ -3241,7 +3235,7 @@
     </w:p>
     <w:p>
       <w:pPr>
-        <w:spacing w:after="120" w:line="276" w:lineRule="auto"/>
+        <w:spacing w:after="120"/>
       </w:pPr>
       <w:r>
         <w:rPr>
@@ -3340,7 +3334,7 @@
                 <w:b w:val="0"/>
                 <w:sz w:val="20"/>
               </w:rPr>
-              <w:t>ежедневно в 06:00 (МСК)</w:t>
+              <w:t>ежедневно в 08:00 (МСК)</w:t>
             </w:r>
           </w:p>
         </w:tc>
@@ -3485,7 +3479,7 @@
     <w:p/>
     <w:p>
       <w:pPr>
-        <w:spacing w:after="120" w:line="276" w:lineRule="auto"/>
+        <w:spacing w:after="120"/>
       </w:pPr>
       <w:r>
         <w:rPr>
@@ -3527,7 +3521,7 @@
     </w:p>
     <w:p>
       <w:pPr>
-        <w:spacing w:after="120" w:line="276" w:lineRule="auto"/>
+        <w:spacing w:after="120"/>
       </w:pPr>
       <w:r>
         <w:rPr>
@@ -3556,7 +3550,7 @@
     </w:p>
     <w:p>
       <w:pPr>
-        <w:spacing w:after="120" w:line="276" w:lineRule="auto"/>
+        <w:spacing w:after="120"/>
       </w:pPr>
       <w:r>
         <w:rPr>
@@ -3569,7 +3563,7 @@
     </w:p>
     <w:p>
       <w:pPr>
-        <w:spacing w:after="120" w:line="276" w:lineRule="auto"/>
+        <w:spacing w:after="120"/>
       </w:pPr>
       <w:r>
         <w:rPr>
@@ -4121,7 +4115,7 @@
     <w:p/>
     <w:p>
       <w:pPr>
-        <w:spacing w:after="120" w:line="276" w:lineRule="auto"/>
+        <w:spacing w:after="120"/>
       </w:pPr>
       <w:r>
         <w:rPr>
@@ -4608,7 +4602,7 @@
     </w:p>
     <w:p>
       <w:pPr>
-        <w:spacing w:after="120" w:line="276" w:lineRule="auto"/>
+        <w:spacing w:after="120"/>
       </w:pPr>
       <w:r>
         <w:rPr>
@@ -4621,7 +4615,7 @@
     </w:p>
     <w:p>
       <w:pPr>
-        <w:spacing w:after="120" w:line="276" w:lineRule="auto"/>
+        <w:spacing w:after="120"/>
       </w:pPr>
       <w:r>
         <w:rPr>
@@ -4634,7 +4628,7 @@
     </w:p>
     <w:p>
       <w:pPr>
-        <w:spacing w:after="120" w:line="276" w:lineRule="auto"/>
+        <w:spacing w:after="120"/>
       </w:pPr>
       <w:r>
         <w:rPr>
@@ -4647,7 +4641,7 @@
     </w:p>
     <w:p>
       <w:pPr>
-        <w:spacing w:after="120" w:line="276" w:lineRule="auto"/>
+        <w:spacing w:after="120"/>
       </w:pPr>
       <w:r>
         <w:rPr>
@@ -4660,7 +4654,7 @@
     </w:p>
     <w:p>
       <w:pPr>
-        <w:spacing w:after="120" w:line="276" w:lineRule="auto"/>
+        <w:spacing w:after="120"/>
       </w:pPr>
       <w:r>
         <w:rPr>
@@ -4673,7 +4667,7 @@
     </w:p>
     <w:p>
       <w:pPr>
-        <w:spacing w:after="120" w:line="276" w:lineRule="auto"/>
+        <w:spacing w:after="120"/>
       </w:pPr>
       <w:r>
         <w:rPr>
@@ -4702,7 +4696,7 @@
     </w:p>
     <w:p>
       <w:pPr>
-        <w:spacing w:after="120" w:line="276" w:lineRule="auto"/>
+        <w:spacing w:after="120"/>
       </w:pPr>
       <w:r>
         <w:rPr>
@@ -4731,7 +4725,7 @@
     </w:p>
     <w:p>
       <w:pPr>
-        <w:spacing w:after="120" w:line="276" w:lineRule="auto"/>
+        <w:spacing w:after="120"/>
       </w:pPr>
       <w:r>
         <w:rPr>
@@ -4760,7 +4754,7 @@
     </w:p>
     <w:p>
       <w:pPr>
-        <w:spacing w:after="120" w:line="276" w:lineRule="auto"/>
+        <w:spacing w:after="120"/>
       </w:pPr>
       <w:r>
         <w:rPr>
@@ -4786,7 +4780,7 @@
     </w:p>
     <w:p>
       <w:pPr>
-        <w:spacing w:after="120" w:line="276" w:lineRule="auto"/>
+        <w:spacing w:after="120"/>
       </w:pPr>
       <w:r>
         <w:rPr>
@@ -4799,7 +4793,7 @@
     </w:p>
     <w:p>
       <w:pPr>
-        <w:spacing w:after="120" w:line="276" w:lineRule="auto"/>
+        <w:spacing w:after="120"/>
       </w:pPr>
       <w:r>
         <w:rPr>
@@ -4812,7 +4806,7 @@
     </w:p>
     <w:p>
       <w:pPr>
-        <w:spacing w:after="120" w:line="276" w:lineRule="auto"/>
+        <w:spacing w:after="120"/>
       </w:pPr>
       <w:r>
         <w:rPr>
@@ -4825,7 +4819,7 @@
     </w:p>
     <w:p>
       <w:pPr>
-        <w:spacing w:after="120" w:line="276" w:lineRule="auto"/>
+        <w:spacing w:after="120"/>
       </w:pPr>
       <w:r>
         <w:rPr>
@@ -4838,7 +4832,7 @@
     </w:p>
     <w:p>
       <w:pPr>
-        <w:spacing w:after="120" w:line="276" w:lineRule="auto"/>
+        <w:spacing w:after="120"/>
       </w:pPr>
       <w:r>
         <w:rPr>
@@ -4864,7 +4858,7 @@
     </w:p>
     <w:p>
       <w:pPr>
-        <w:spacing w:after="120" w:line="276" w:lineRule="auto"/>
+        <w:spacing w:after="120"/>
       </w:pPr>
       <w:r>
         <w:rPr>
@@ -4877,7 +4871,7 @@
     </w:p>
     <w:p>
       <w:pPr>
-        <w:spacing w:after="120" w:line="276" w:lineRule="auto"/>
+        <w:spacing w:after="120"/>
       </w:pPr>
       <w:r>
         <w:rPr>
@@ -4890,7 +4884,7 @@
     </w:p>
     <w:p>
       <w:pPr>
-        <w:spacing w:after="120" w:line="276" w:lineRule="auto"/>
+        <w:spacing w:after="120"/>
       </w:pPr>
       <w:r>
         <w:rPr>
@@ -4903,7 +4897,7 @@
     </w:p>
     <w:p>
       <w:pPr>
-        <w:spacing w:after="120" w:line="276" w:lineRule="auto"/>
+        <w:spacing w:after="120"/>
       </w:pPr>
       <w:r>
         <w:rPr>
@@ -4916,7 +4910,7 @@
     </w:p>
     <w:p>
       <w:pPr>
-        <w:spacing w:after="120" w:line="276" w:lineRule="auto"/>
+        <w:spacing w:after="120"/>
       </w:pPr>
       <w:r>
         <w:rPr>
@@ -4929,7 +4923,7 @@
     </w:p>
     <w:p>
       <w:pPr>
-        <w:spacing w:after="120" w:line="276" w:lineRule="auto"/>
+        <w:spacing w:after="120"/>
       </w:pPr>
       <w:r>
         <w:rPr>
@@ -4942,7 +4936,7 @@
     </w:p>
     <w:p>
       <w:pPr>
-        <w:spacing w:after="120" w:line="276" w:lineRule="auto"/>
+        <w:spacing w:after="120"/>
       </w:pPr>
       <w:r>
         <w:rPr>
@@ -4955,7 +4949,7 @@
     </w:p>
     <w:p>
       <w:pPr>
-        <w:spacing w:after="120" w:line="276" w:lineRule="auto"/>
+        <w:spacing w:after="120"/>
       </w:pPr>
       <w:r>
         <w:rPr>
@@ -4968,7 +4962,7 @@
     </w:p>
     <w:p>
       <w:pPr>
-        <w:spacing w:after="120" w:line="276" w:lineRule="auto"/>
+        <w:spacing w:after="120"/>
       </w:pPr>
       <w:r>
         <w:rPr>
@@ -5170,7 +5164,7 @@
     </w:p>
     <w:p>
       <w:pPr>
-        <w:spacing w:after="120" w:line="276" w:lineRule="auto"/>
+        <w:spacing w:after="120"/>
       </w:pPr>
       <w:r>
         <w:rPr>
@@ -5183,7 +5177,7 @@
     </w:p>
     <w:p>
       <w:pPr>
-        <w:spacing w:after="120" w:line="276" w:lineRule="auto"/>
+        <w:spacing w:after="120"/>
       </w:pPr>
       <w:r>
         <w:rPr>
@@ -5212,7 +5206,7 @@
     </w:p>
     <w:p>
       <w:pPr>
-        <w:spacing w:after="120" w:line="276" w:lineRule="auto"/>
+        <w:spacing w:after="120"/>
       </w:pPr>
       <w:r>
         <w:rPr>
@@ -5241,7 +5235,7 @@
     </w:p>
     <w:p>
       <w:pPr>
-        <w:spacing w:after="120" w:line="276" w:lineRule="auto"/>
+        <w:spacing w:after="120"/>
       </w:pPr>
       <w:r>
         <w:rPr>
@@ -5254,7 +5248,7 @@
     </w:p>
     <w:p>
       <w:pPr>
-        <w:spacing w:after="120" w:line="276" w:lineRule="auto"/>
+        <w:spacing w:after="120"/>
       </w:pPr>
       <w:r>
         <w:rPr>
@@ -5267,7 +5261,7 @@
     </w:p>
     <w:p>
       <w:pPr>
-        <w:spacing w:after="120" w:line="276" w:lineRule="auto"/>
+        <w:spacing w:after="120"/>
       </w:pPr>
       <w:r>
         <w:rPr>
@@ -5280,7 +5274,7 @@
     </w:p>
     <w:p>
       <w:pPr>
-        <w:spacing w:after="120" w:line="276" w:lineRule="auto"/>
+        <w:spacing w:after="120"/>
       </w:pPr>
       <w:r>
         <w:rPr>
@@ -5293,7 +5287,7 @@
     </w:p>
     <w:p>
       <w:pPr>
-        <w:spacing w:after="120" w:line="276" w:lineRule="auto"/>
+        <w:spacing w:after="120"/>
       </w:pPr>
       <w:r>
         <w:rPr>
@@ -5319,7 +5313,7 @@
     </w:p>
     <w:p>
       <w:pPr>
-        <w:spacing w:after="120" w:line="276" w:lineRule="auto"/>
+        <w:spacing w:after="120"/>
       </w:pPr>
       <w:r>
         <w:rPr>
@@ -5332,7 +5326,7 @@
     </w:p>
     <w:p>
       <w:pPr>
-        <w:spacing w:after="120" w:line="276" w:lineRule="auto"/>
+        <w:spacing w:after="120"/>
       </w:pPr>
       <w:r>
         <w:rPr>
@@ -5345,7 +5339,7 @@
     </w:p>
     <w:p>
       <w:pPr>
-        <w:spacing w:after="120" w:line="276" w:lineRule="auto"/>
+        <w:spacing w:after="120"/>
       </w:pPr>
       <w:r>
         <w:rPr>
@@ -5358,7 +5352,7 @@
     </w:p>
     <w:p>
       <w:pPr>
-        <w:spacing w:after="120" w:line="276" w:lineRule="auto"/>
+        <w:spacing w:after="120"/>
       </w:pPr>
       <w:r>
         <w:rPr>
@@ -5742,10 +5736,6 @@
     <w:name w:val="Normal"/>
     <w:qFormat/>
     <w:rsid w:val="00FC693F"/>
-    <w:rPr>
-      <w:rFonts w:ascii="Times New Roman" w:hAnsi="Times New Roman" w:eastAsia="Times New Roman"/>
-      <w:sz w:val="24"/>
-    </w:rPr>
   </w:style>
   <w:style w:type="paragraph" w:styleId="Header">
     <w:name w:val="header"/>

</xml_diff>